<commit_message>
Correções feitas de acordo que foi retornado no PR
</commit_message>
<xml_diff>
--- a/Documentation/WORD/Sprint15_Task156_Analisar_Design_systems.docx
+++ b/Documentation/WORD/Sprint15_Task156_Analisar_Design_systems.docx
@@ -1,6 +1,6 @@
 
 <file path=word/document.xml><?xml version="1.0" encoding="utf-8"?>
-<w:document xmlns:wpc="http://schemas.microsoft.com/office/word/2010/wordprocessingCanvas" xmlns:cx="http://schemas.microsoft.com/office/drawing/2014/chartex" xmlns:cx1="http://schemas.microsoft.com/office/drawing/2015/9/8/chartex" xmlns:cx2="http://schemas.microsoft.com/office/drawing/2015/10/21/chartex" xmlns:cx3="http://schemas.microsoft.com/office/drawing/2016/5/9/chartex" xmlns:cx4="http://schemas.microsoft.com/office/drawing/2016/5/10/chartex" xmlns:cx5="http://schemas.microsoft.com/office/drawing/2016/5/11/chartex" xmlns:cx6="http://schemas.microsoft.com/office/drawing/2016/5/12/chartex" xmlns:cx7="http://schemas.microsoft.com/office/drawing/2016/5/13/chartex" xmlns:cx8="http://schemas.microsoft.com/office/drawing/2016/5/14/chartex" xmlns:mc="http://schemas.openxmlformats.org/markup-compatibility/2006" xmlns:aink="http://schemas.microsoft.com/office/drawing/2016/ink" xmlns:am3d="http://schemas.microsoft.com/office/drawing/2017/model3d" xmlns:o="urn:schemas-microsoft-com:office:office" xmlns:oel="http://schemas.microsoft.com/office/2019/extlst" xmlns:r="http://schemas.openxmlformats.org/officeDocument/2006/relationships" xmlns:m="http://schemas.openxmlformats.org/officeDocument/2006/math" xmlns:v="urn:schemas-microsoft-com:vml" xmlns:wp14="http://schemas.microsoft.com/office/word/2010/wordprocessingDrawing" xmlns:wp="http://schemas.openxmlformats.org/drawingml/2006/wordprocessingDrawing" xmlns:w10="urn:schemas-microsoft-com:office:word" xmlns:w="http://schemas.openxmlformats.org/wordprocessingml/2006/main" xmlns:w14="http://schemas.microsoft.com/office/word/2010/wordml" xmlns:w15="http://schemas.microsoft.com/office/word/2012/wordml" xmlns:w16cex="http://schemas.microsoft.com/office/word/2018/wordml/cex" xmlns:w16cid="http://schemas.microsoft.com/office/word/2016/wordml/cid" xmlns:w16="http://schemas.microsoft.com/office/word/2018/wordml" xmlns:w16sdtdh="http://schemas.microsoft.com/office/word/2020/wordml/sdtdatahash" xmlns:w16se="http://schemas.microsoft.com/office/word/2015/wordml/symex" xmlns:wpg="http://schemas.microsoft.com/office/word/2010/wordprocessingGroup" xmlns:wpi="http://schemas.microsoft.com/office/word/2010/wordprocessingInk" xmlns:wne="http://schemas.microsoft.com/office/word/2006/wordml" xmlns:wps="http://schemas.microsoft.com/office/word/2010/wordprocessingShape" mc:Ignorable="w14 w15 w16se w16cid w16 w16cex w16sdtdh wp14">
+<w:document xmlns:wpc="http://schemas.microsoft.com/office/word/2010/wordprocessingCanvas" xmlns:mc="http://schemas.openxmlformats.org/markup-compatibility/2006" xmlns:o="urn:schemas-microsoft-com:office:office" xmlns:r="http://schemas.openxmlformats.org/officeDocument/2006/relationships" xmlns:m="http://schemas.openxmlformats.org/officeDocument/2006/math" xmlns:v="urn:schemas-microsoft-com:vml" xmlns:wp14="http://schemas.microsoft.com/office/word/2010/wordprocessingDrawing" xmlns:wp="http://schemas.openxmlformats.org/drawingml/2006/wordprocessingDrawing" xmlns:w10="urn:schemas-microsoft-com:office:word" xmlns:w="http://schemas.openxmlformats.org/wordprocessingml/2006/main" xmlns:w14="http://schemas.microsoft.com/office/word/2010/wordml" xmlns:wpg="http://schemas.microsoft.com/office/word/2010/wordprocessingGroup" xmlns:wpi="http://schemas.microsoft.com/office/word/2010/wordprocessingInk" xmlns:wne="http://schemas.microsoft.com/office/word/2006/wordml" xmlns:wps="http://schemas.microsoft.com/office/word/2010/wordprocessingShape" mc:Ignorable="w14 wp14">
   <w:body>
     <w:p>
       <w:pPr>
@@ -12,6 +12,7 @@
           <w:noProof/>
           <w:snapToGrid w:val="0"/>
           <w:sz w:val="24"/>
+          <w:lang w:eastAsia="pt-BR"/>
         </w:rPr>
         <w:drawing>
           <wp:inline distT="0" distB="0" distL="0" distR="0" wp14:anchorId="08E87A71" wp14:editId="22BD9F5E">
@@ -31,7 +32,7 @@
                     </pic:cNvPicPr>
                   </pic:nvPicPr>
                   <pic:blipFill>
-                    <a:blip r:embed="rId8" cstate="print">
+                    <a:blip r:embed="rId9" cstate="print">
                       <a:extLst>
                         <a:ext uri="{28A0092B-C50C-407E-A947-70E740481C1C}">
                           <a14:useLocalDpi xmlns:a14="http://schemas.microsoft.com/office/drawing/2010/main" val="0"/>
@@ -104,8 +105,20 @@
                 <w:sz w:val="28"/>
                 <w:szCs w:val="28"/>
               </w:rPr>
-              <w:t>Sprint Documentation</w:t>
-            </w:r>
+              <w:t xml:space="preserve">Sprint </w:t>
+            </w:r>
+            <w:proofErr w:type="spellStart"/>
+            <w:r>
+              <w:rPr>
+                <w:b/>
+                <w:bCs/>
+                <w:color w:val="FFFFFF" w:themeColor="background1"/>
+                <w:sz w:val="28"/>
+                <w:szCs w:val="28"/>
+              </w:rPr>
+              <w:t>Documentation</w:t>
+            </w:r>
+            <w:proofErr w:type="spellEnd"/>
           </w:p>
         </w:tc>
       </w:tr>
@@ -282,12 +295,37 @@
                 <w:bCs/>
               </w:rPr>
             </w:pPr>
-            <w:r>
-              <w:rPr>
-                <w:b/>
-                <w:bCs/>
-              </w:rPr>
-              <w:t>Projetc Name:</w:t>
+            <w:proofErr w:type="spellStart"/>
+            <w:r>
+              <w:rPr>
+                <w:b/>
+                <w:bCs/>
+              </w:rPr>
+              <w:t>Projetc</w:t>
+            </w:r>
+            <w:proofErr w:type="spellEnd"/>
+            <w:r>
+              <w:rPr>
+                <w:b/>
+                <w:bCs/>
+              </w:rPr>
+              <w:t xml:space="preserve"> </w:t>
+            </w:r>
+            <w:proofErr w:type="spellStart"/>
+            <w:r>
+              <w:rPr>
+                <w:b/>
+                <w:bCs/>
+              </w:rPr>
+              <w:t>Name</w:t>
+            </w:r>
+            <w:proofErr w:type="spellEnd"/>
+            <w:r>
+              <w:rPr>
+                <w:b/>
+                <w:bCs/>
+              </w:rPr>
+              <w:t>:</w:t>
             </w:r>
           </w:p>
         </w:tc>
@@ -303,6 +341,8 @@
                 <w:bCs/>
               </w:rPr>
             </w:pPr>
+            <w:proofErr w:type="spellStart"/>
+            <w:proofErr w:type="gramStart"/>
             <w:r>
               <w:rPr>
                 <w:b/>
@@ -315,8 +355,17 @@
                 <w:b/>
                 <w:bCs/>
               </w:rPr>
-              <w:t>ivitas-frontend</w:t>
-            </w:r>
+              <w:t>ivitas</w:t>
+            </w:r>
+            <w:proofErr w:type="gramEnd"/>
+            <w:r>
+              <w:rPr>
+                <w:b/>
+                <w:bCs/>
+              </w:rPr>
+              <w:t>-frontend</w:t>
+            </w:r>
+            <w:proofErr w:type="spellEnd"/>
           </w:p>
         </w:tc>
       </w:tr>
@@ -384,8 +433,18 @@
                 <w:bCs/>
                 <w:color w:val="FFFFFF" w:themeColor="background1"/>
               </w:rPr>
-              <w:t>Team Members</w:t>
-            </w:r>
+              <w:t xml:space="preserve">Team </w:t>
+            </w:r>
+            <w:proofErr w:type="spellStart"/>
+            <w:r>
+              <w:rPr>
+                <w:b/>
+                <w:bCs/>
+                <w:color w:val="FFFFFF" w:themeColor="background1"/>
+              </w:rPr>
+              <w:t>Members</w:t>
+            </w:r>
+            <w:proofErr w:type="spellEnd"/>
           </w:p>
         </w:tc>
       </w:tr>
@@ -409,8 +468,13 @@
             <w:gridSpan w:val="4"/>
           </w:tcPr>
           <w:p>
-            <w:r>
-              <w:t>Adryan Thiago de Oliveira Francisco</w:t>
+            <w:proofErr w:type="spellStart"/>
+            <w:r>
+              <w:t>Adryan</w:t>
+            </w:r>
+            <w:proofErr w:type="spellEnd"/>
+            <w:r>
+              <w:t xml:space="preserve"> Thiago de Oliveira Francisco</w:t>
             </w:r>
           </w:p>
         </w:tc>
@@ -424,10 +488,10 @@
         <w:tblLook w:val="04A0" w:firstRow="1" w:lastRow="0" w:firstColumn="1" w:lastColumn="0" w:noHBand="0" w:noVBand="1"/>
       </w:tblPr>
       <w:tblGrid>
-        <w:gridCol w:w="754"/>
-        <w:gridCol w:w="6234"/>
-        <w:gridCol w:w="1541"/>
-        <w:gridCol w:w="1672"/>
+        <w:gridCol w:w="792"/>
+        <w:gridCol w:w="6201"/>
+        <w:gridCol w:w="1539"/>
+        <w:gridCol w:w="1669"/>
       </w:tblGrid>
       <w:tr>
         <w:tc>
@@ -449,8 +513,17 @@
                 <w:b/>
                 <w:bCs/>
               </w:rPr>
-              <w:t>Sprint Backlog</w:t>
-            </w:r>
+              <w:t xml:space="preserve">Sprint </w:t>
+            </w:r>
+            <w:proofErr w:type="spellStart"/>
+            <w:r>
+              <w:rPr>
+                <w:b/>
+                <w:bCs/>
+              </w:rPr>
+              <w:t>Backlog</w:t>
+            </w:r>
+            <w:proofErr w:type="spellEnd"/>
           </w:p>
         </w:tc>
       </w:tr>
@@ -460,8 +533,13 @@
             <w:tcW w:w="754" w:type="dxa"/>
           </w:tcPr>
           <w:p>
-            <w:r>
-              <w:t>Task#</w:t>
+            <w:proofErr w:type="spellStart"/>
+            <w:r>
+              <w:t>Task</w:t>
+            </w:r>
+            <w:proofErr w:type="spellEnd"/>
+            <w:r>
+              <w:t>#</w:t>
             </w:r>
           </w:p>
         </w:tc>
@@ -470,9 +548,11 @@
             <w:tcW w:w="6234" w:type="dxa"/>
           </w:tcPr>
           <w:p>
+            <w:proofErr w:type="spellStart"/>
             <w:r>
               <w:t>Description</w:t>
             </w:r>
+            <w:proofErr w:type="spellEnd"/>
           </w:p>
         </w:tc>
         <w:tc>
@@ -519,8 +599,13 @@
           </w:tcPr>
           <w:p>
             <w:r>
-              <w:t>Analisar design systems, acessibilidade e componentes</w:t>
-            </w:r>
+              <w:t xml:space="preserve">Analisar design systems, acessibilidade e </w:t>
+            </w:r>
+            <w:proofErr w:type="gramStart"/>
+            <w:r>
+              <w:t>componentes</w:t>
+            </w:r>
+            <w:proofErr w:type="gramEnd"/>
           </w:p>
           <w:p/>
         </w:tc>
@@ -600,13 +685,31 @@
                 <w:bCs/>
               </w:rPr>
             </w:pPr>
-            <w:r>
-              <w:rPr>
-                <w:b/>
-                <w:bCs/>
-              </w:rPr>
-              <w:t>Task Description</w:t>
-            </w:r>
+            <w:proofErr w:type="spellStart"/>
+            <w:r>
+              <w:rPr>
+                <w:b/>
+                <w:bCs/>
+              </w:rPr>
+              <w:t>Task</w:t>
+            </w:r>
+            <w:proofErr w:type="spellEnd"/>
+            <w:r>
+              <w:rPr>
+                <w:b/>
+                <w:bCs/>
+              </w:rPr>
+              <w:t xml:space="preserve"> </w:t>
+            </w:r>
+            <w:proofErr w:type="spellStart"/>
+            <w:r>
+              <w:rPr>
+                <w:b/>
+                <w:bCs/>
+              </w:rPr>
+              <w:t>Description</w:t>
+            </w:r>
+            <w:proofErr w:type="spellEnd"/>
           </w:p>
         </w:tc>
       </w:tr>
@@ -616,8 +719,13 @@
             <w:tcW w:w="828" w:type="dxa"/>
           </w:tcPr>
           <w:p>
-            <w:r>
-              <w:t>Task #</w:t>
+            <w:proofErr w:type="spellStart"/>
+            <w:r>
+              <w:t>Task</w:t>
+            </w:r>
+            <w:proofErr w:type="spellEnd"/>
+            <w:r>
+              <w:t xml:space="preserve"> #</w:t>
             </w:r>
           </w:p>
         </w:tc>
@@ -626,9 +734,11 @@
             <w:tcW w:w="2971" w:type="dxa"/>
           </w:tcPr>
           <w:p>
+            <w:proofErr w:type="spellStart"/>
             <w:r>
               <w:t>Description</w:t>
             </w:r>
+            <w:proofErr w:type="spellEnd"/>
           </w:p>
         </w:tc>
         <w:tc>
@@ -636,9 +746,19 @@
             <w:tcW w:w="1441" w:type="dxa"/>
           </w:tcPr>
           <w:p>
-            <w:r>
-              <w:t>Assigned To</w:t>
-            </w:r>
+            <w:proofErr w:type="spellStart"/>
+            <w:r>
+              <w:t>Assigned</w:t>
+            </w:r>
+            <w:proofErr w:type="spellEnd"/>
+            <w:r>
+              <w:t xml:space="preserve"> </w:t>
+            </w:r>
+            <w:proofErr w:type="spellStart"/>
+            <w:r>
+              <w:t>To</w:t>
+            </w:r>
+            <w:proofErr w:type="spellEnd"/>
           </w:p>
         </w:tc>
         <w:tc>
@@ -656,8 +776,13 @@
             <w:tcW w:w="1842" w:type="dxa"/>
           </w:tcPr>
           <w:p>
-            <w:r>
-              <w:t>Estimated Hours</w:t>
+            <w:proofErr w:type="spellStart"/>
+            <w:r>
+              <w:t>Estimated</w:t>
+            </w:r>
+            <w:proofErr w:type="spellEnd"/>
+            <w:r>
+              <w:t xml:space="preserve"> Hours</w:t>
             </w:r>
           </w:p>
         </w:tc>
@@ -666,8 +791,13 @@
             <w:tcW w:w="1683" w:type="dxa"/>
           </w:tcPr>
           <w:p>
-            <w:r>
-              <w:t>Logged Hours</w:t>
+            <w:proofErr w:type="spellStart"/>
+            <w:r>
+              <w:t>Logged</w:t>
+            </w:r>
+            <w:proofErr w:type="spellEnd"/>
+            <w:r>
+              <w:t xml:space="preserve"> Hours</w:t>
             </w:r>
           </w:p>
         </w:tc>
@@ -695,8 +825,13 @@
           </w:tcPr>
           <w:p>
             <w:r>
-              <w:t>Analisar design systems, acessibilidade e componentes para sistemas administrativos</w:t>
-            </w:r>
+              <w:t xml:space="preserve">Analisar design systems, acessibilidade e componentes para sistemas </w:t>
+            </w:r>
+            <w:proofErr w:type="gramStart"/>
+            <w:r>
+              <w:t>administrativos</w:t>
+            </w:r>
+            <w:proofErr w:type="gramEnd"/>
           </w:p>
         </w:tc>
         <w:tc>
@@ -710,9 +845,19 @@
             <w:r>
               <w:t xml:space="preserve">, </w:t>
             </w:r>
-            <w:r>
-              <w:t>Adryan Thiago de Oliveira Francisco</w:t>
-            </w:r>
+            <w:proofErr w:type="spellStart"/>
+            <w:r>
+              <w:t>Adryan</w:t>
+            </w:r>
+            <w:proofErr w:type="spellEnd"/>
+            <w:r>
+              <w:t xml:space="preserve"> Thiago de Oliveira </w:t>
+            </w:r>
+            <w:proofErr w:type="gramStart"/>
+            <w:r>
+              <w:t>Francisco</w:t>
+            </w:r>
+            <w:proofErr w:type="gramEnd"/>
           </w:p>
         </w:tc>
         <w:tc>
@@ -782,6 +927,7 @@
         </w:rPr>
         <w:t xml:space="preserve">Sprint </w:t>
       </w:r>
+      <w:proofErr w:type="spellStart"/>
       <w:r>
         <w:rPr>
           <w:b/>
@@ -792,6 +938,7 @@
         </w:rPr>
         <w:t>Description</w:t>
       </w:r>
+      <w:proofErr w:type="spellEnd"/>
     </w:p>
     <w:p>
       <w:pPr>
@@ -818,7 +965,35 @@
         <w:rPr>
           <w:rFonts w:ascii="Segoe UI Emoji" w:hAnsi="Segoe UI Emoji" w:cs="Segoe UI Emoji"/>
         </w:rPr>
-        <w:t>Pesquisar design systems, bibliotecas visuais, guias de acessibilidade e padroes de componentes aplicados a sistemas administrativos para entender como estruturar uma interface consistente, reutilizavel e clara.</w:t>
+        <w:t xml:space="preserve">Pesquisar design systems, bibliotecas visuais, guias de acessibilidade e </w:t>
+      </w:r>
+      <w:proofErr w:type="spellStart"/>
+      <w:r>
+        <w:rPr>
+          <w:rFonts w:ascii="Segoe UI Emoji" w:hAnsi="Segoe UI Emoji" w:cs="Segoe UI Emoji"/>
+        </w:rPr>
+        <w:t>padroes</w:t>
+      </w:r>
+      <w:proofErr w:type="spellEnd"/>
+      <w:r>
+        <w:rPr>
+          <w:rFonts w:ascii="Segoe UI Emoji" w:hAnsi="Segoe UI Emoji" w:cs="Segoe UI Emoji"/>
+        </w:rPr>
+        <w:t xml:space="preserve"> de componentes aplicados a sistemas administrativos para entender como estruturar uma interface consistente, </w:t>
+      </w:r>
+      <w:proofErr w:type="spellStart"/>
+      <w:r>
+        <w:rPr>
+          <w:rFonts w:ascii="Segoe UI Emoji" w:hAnsi="Segoe UI Emoji" w:cs="Segoe UI Emoji"/>
+        </w:rPr>
+        <w:t>reutilizavel</w:t>
+      </w:r>
+      <w:proofErr w:type="spellEnd"/>
+      <w:r>
+        <w:rPr>
+          <w:rFonts w:ascii="Segoe UI Emoji" w:hAnsi="Segoe UI Emoji" w:cs="Segoe UI Emoji"/>
+        </w:rPr>
+        <w:t xml:space="preserve"> e clara.</w:t>
       </w:r>
     </w:p>
     <w:p>
@@ -846,7 +1021,21 @@
         <w:rPr>
           <w:rFonts w:ascii="Segoe UI Emoji" w:hAnsi="Segoe UI Emoji" w:cs="Segoe UI Emoji"/>
         </w:rPr>
-        <w:t>Levantar referencias de design systems ou guias de interface para produtos administrativos e institucionais.</w:t>
+        <w:t xml:space="preserve">Levantar </w:t>
+      </w:r>
+      <w:proofErr w:type="gramStart"/>
+      <w:r>
+        <w:rPr>
+          <w:rFonts w:ascii="Segoe UI Emoji" w:hAnsi="Segoe UI Emoji" w:cs="Segoe UI Emoji"/>
+        </w:rPr>
+        <w:t>referencias</w:t>
+      </w:r>
+      <w:proofErr w:type="gramEnd"/>
+      <w:r>
+        <w:rPr>
+          <w:rFonts w:ascii="Segoe UI Emoji" w:hAnsi="Segoe UI Emoji" w:cs="Segoe UI Emoji"/>
+        </w:rPr>
+        <w:t xml:space="preserve"> de design systems ou guias de interface para produtos administrativos e institucionais.</w:t>
       </w:r>
     </w:p>
     <w:p>
@@ -860,7 +1049,49 @@
         <w:rPr>
           <w:rFonts w:ascii="Segoe UI Emoji" w:hAnsi="Segoe UI Emoji" w:cs="Segoe UI Emoji"/>
         </w:rPr>
-        <w:t>Mapear boas praticas para componentes como cards, tabelas, formularios, filtros, modais, estados vazios e mensagens de erro.</w:t>
+        <w:t xml:space="preserve">Mapear boas </w:t>
+      </w:r>
+      <w:proofErr w:type="gramStart"/>
+      <w:r>
+        <w:rPr>
+          <w:rFonts w:ascii="Segoe UI Emoji" w:hAnsi="Segoe UI Emoji" w:cs="Segoe UI Emoji"/>
+        </w:rPr>
+        <w:t>praticas</w:t>
+      </w:r>
+      <w:proofErr w:type="gramEnd"/>
+      <w:r>
+        <w:rPr>
+          <w:rFonts w:ascii="Segoe UI Emoji" w:hAnsi="Segoe UI Emoji" w:cs="Segoe UI Emoji"/>
+        </w:rPr>
+        <w:t xml:space="preserve"> para componentes como </w:t>
+      </w:r>
+      <w:proofErr w:type="spellStart"/>
+      <w:r>
+        <w:rPr>
+          <w:rFonts w:ascii="Segoe UI Emoji" w:hAnsi="Segoe UI Emoji" w:cs="Segoe UI Emoji"/>
+        </w:rPr>
+        <w:t>cards</w:t>
+      </w:r>
+      <w:proofErr w:type="spellEnd"/>
+      <w:r>
+        <w:rPr>
+          <w:rFonts w:ascii="Segoe UI Emoji" w:hAnsi="Segoe UI Emoji" w:cs="Segoe UI Emoji"/>
+        </w:rPr>
+        <w:t xml:space="preserve">, tabelas, </w:t>
+      </w:r>
+      <w:proofErr w:type="spellStart"/>
+      <w:r>
+        <w:rPr>
+          <w:rFonts w:ascii="Segoe UI Emoji" w:hAnsi="Segoe UI Emoji" w:cs="Segoe UI Emoji"/>
+        </w:rPr>
+        <w:t>formularios</w:t>
+      </w:r>
+      <w:proofErr w:type="spellEnd"/>
+      <w:r>
+        <w:rPr>
+          <w:rFonts w:ascii="Segoe UI Emoji" w:hAnsi="Segoe UI Emoji" w:cs="Segoe UI Emoji"/>
+        </w:rPr>
+        <w:t>, filtros, modais, estados vazios e mensagens de erro.</w:t>
       </w:r>
     </w:p>
     <w:p>
@@ -874,7 +1105,63 @@
         <w:rPr>
           <w:rFonts w:ascii="Segoe UI Emoji" w:hAnsi="Segoe UI Emoji" w:cs="Segoe UI Emoji"/>
         </w:rPr>
-        <w:t>Identificar criterios de acessibilidade, contraste, responsividade e consistencia visual aplicaveis ao projeto.</w:t>
+        <w:t xml:space="preserve">Identificar </w:t>
+      </w:r>
+      <w:proofErr w:type="spellStart"/>
+      <w:r>
+        <w:rPr>
+          <w:rFonts w:ascii="Segoe UI Emoji" w:hAnsi="Segoe UI Emoji" w:cs="Segoe UI Emoji"/>
+        </w:rPr>
+        <w:t>criterios</w:t>
+      </w:r>
+      <w:proofErr w:type="spellEnd"/>
+      <w:r>
+        <w:rPr>
+          <w:rFonts w:ascii="Segoe UI Emoji" w:hAnsi="Segoe UI Emoji" w:cs="Segoe UI Emoji"/>
+        </w:rPr>
+        <w:t xml:space="preserve"> de acessibilidade, contraste, </w:t>
+      </w:r>
+      <w:proofErr w:type="spellStart"/>
+      <w:r>
+        <w:rPr>
+          <w:rFonts w:ascii="Segoe UI Emoji" w:hAnsi="Segoe UI Emoji" w:cs="Segoe UI Emoji"/>
+        </w:rPr>
+        <w:t>responsividade</w:t>
+      </w:r>
+      <w:proofErr w:type="spellEnd"/>
+      <w:r>
+        <w:rPr>
+          <w:rFonts w:ascii="Segoe UI Emoji" w:hAnsi="Segoe UI Emoji" w:cs="Segoe UI Emoji"/>
+        </w:rPr>
+        <w:t xml:space="preserve"> e </w:t>
+      </w:r>
+      <w:proofErr w:type="spellStart"/>
+      <w:r>
+        <w:rPr>
+          <w:rFonts w:ascii="Segoe UI Emoji" w:hAnsi="Segoe UI Emoji" w:cs="Segoe UI Emoji"/>
+        </w:rPr>
+        <w:t>consistencia</w:t>
+      </w:r>
+      <w:proofErr w:type="spellEnd"/>
+      <w:r>
+        <w:rPr>
+          <w:rFonts w:ascii="Segoe UI Emoji" w:hAnsi="Segoe UI Emoji" w:cs="Segoe UI Emoji"/>
+        </w:rPr>
+        <w:t xml:space="preserve"> visual </w:t>
+      </w:r>
+      <w:proofErr w:type="spellStart"/>
+      <w:r>
+        <w:rPr>
+          <w:rFonts w:ascii="Segoe UI Emoji" w:hAnsi="Segoe UI Emoji" w:cs="Segoe UI Emoji"/>
+        </w:rPr>
+        <w:t>aplicaveis</w:t>
+      </w:r>
+      <w:proofErr w:type="spellEnd"/>
+      <w:r>
+        <w:rPr>
+          <w:rFonts w:ascii="Segoe UI Emoji" w:hAnsi="Segoe UI Emoji" w:cs="Segoe UI Emoji"/>
+        </w:rPr>
+        <w:t xml:space="preserve"> ao projeto.</w:t>
       </w:r>
     </w:p>
     <w:p>
@@ -888,7 +1175,63 @@
         <w:rPr>
           <w:rFonts w:ascii="Segoe UI Emoji" w:hAnsi="Segoe UI Emoji" w:cs="Segoe UI Emoji"/>
         </w:rPr>
-        <w:t>Relacionar esses padroes com decisoes praticas para o frontend do sistema.</w:t>
+        <w:t xml:space="preserve">Relacionar esses </w:t>
+      </w:r>
+      <w:proofErr w:type="spellStart"/>
+      <w:r>
+        <w:rPr>
+          <w:rFonts w:ascii="Segoe UI Emoji" w:hAnsi="Segoe UI Emoji" w:cs="Segoe UI Emoji"/>
+        </w:rPr>
+        <w:t>padroes</w:t>
+      </w:r>
+      <w:proofErr w:type="spellEnd"/>
+      <w:r>
+        <w:rPr>
+          <w:rFonts w:ascii="Segoe UI Emoji" w:hAnsi="Segoe UI Emoji" w:cs="Segoe UI Emoji"/>
+        </w:rPr>
+        <w:t xml:space="preserve"> com </w:t>
+      </w:r>
+      <w:proofErr w:type="spellStart"/>
+      <w:r>
+        <w:rPr>
+          <w:rFonts w:ascii="Segoe UI Emoji" w:hAnsi="Segoe UI Emoji" w:cs="Segoe UI Emoji"/>
+        </w:rPr>
+        <w:t>decisoes</w:t>
+      </w:r>
+      <w:proofErr w:type="spellEnd"/>
+      <w:r>
+        <w:rPr>
+          <w:rFonts w:ascii="Segoe UI Emoji" w:hAnsi="Segoe UI Emoji" w:cs="Segoe UI Emoji"/>
+        </w:rPr>
+        <w:t xml:space="preserve"> </w:t>
+      </w:r>
+      <w:proofErr w:type="gramStart"/>
+      <w:r>
+        <w:rPr>
+          <w:rFonts w:ascii="Segoe UI Emoji" w:hAnsi="Segoe UI Emoji" w:cs="Segoe UI Emoji"/>
+        </w:rPr>
+        <w:t>praticas</w:t>
+      </w:r>
+      <w:proofErr w:type="gramEnd"/>
+      <w:r>
+        <w:rPr>
+          <w:rFonts w:ascii="Segoe UI Emoji" w:hAnsi="Segoe UI Emoji" w:cs="Segoe UI Emoji"/>
+        </w:rPr>
+        <w:t xml:space="preserve"> para o </w:t>
+      </w:r>
+      <w:proofErr w:type="spellStart"/>
+      <w:r>
+        <w:rPr>
+          <w:rFonts w:ascii="Segoe UI Emoji" w:hAnsi="Segoe UI Emoji" w:cs="Segoe UI Emoji"/>
+        </w:rPr>
+        <w:t>frontend</w:t>
+      </w:r>
+      <w:proofErr w:type="spellEnd"/>
+      <w:r>
+        <w:rPr>
+          <w:rFonts w:ascii="Segoe UI Emoji" w:hAnsi="Segoe UI Emoji" w:cs="Segoe UI Emoji"/>
+        </w:rPr>
+        <w:t xml:space="preserve"> do sistema.</w:t>
       </w:r>
     </w:p>
     <w:p>
@@ -902,7 +1245,49 @@
         <w:rPr>
           <w:rFonts w:ascii="Segoe UI Emoji" w:hAnsi="Segoe UI Emoji" w:cs="Segoe UI Emoji"/>
         </w:rPr>
-        <w:t>Entregar uma proposta de melhoria global para o projeto atual, com recomendacoes de padrao visual, componentes compartilhados e regras reutilizaveis para todas as telas.</w:t>
+        <w:t xml:space="preserve">Entregar uma proposta de melhoria global para o projeto atual, com </w:t>
+      </w:r>
+      <w:proofErr w:type="spellStart"/>
+      <w:r>
+        <w:rPr>
+          <w:rFonts w:ascii="Segoe UI Emoji" w:hAnsi="Segoe UI Emoji" w:cs="Segoe UI Emoji"/>
+        </w:rPr>
+        <w:t>recomendacoes</w:t>
+      </w:r>
+      <w:proofErr w:type="spellEnd"/>
+      <w:r>
+        <w:rPr>
+          <w:rFonts w:ascii="Segoe UI Emoji" w:hAnsi="Segoe UI Emoji" w:cs="Segoe UI Emoji"/>
+        </w:rPr>
+        <w:t xml:space="preserve"> de </w:t>
+      </w:r>
+      <w:proofErr w:type="spellStart"/>
+      <w:r>
+        <w:rPr>
+          <w:rFonts w:ascii="Segoe UI Emoji" w:hAnsi="Segoe UI Emoji" w:cs="Segoe UI Emoji"/>
+        </w:rPr>
+        <w:t>padrao</w:t>
+      </w:r>
+      <w:proofErr w:type="spellEnd"/>
+      <w:r>
+        <w:rPr>
+          <w:rFonts w:ascii="Segoe UI Emoji" w:hAnsi="Segoe UI Emoji" w:cs="Segoe UI Emoji"/>
+        </w:rPr>
+        <w:t xml:space="preserve"> visual, componentes compartilhados e regras </w:t>
+      </w:r>
+      <w:proofErr w:type="spellStart"/>
+      <w:r>
+        <w:rPr>
+          <w:rFonts w:ascii="Segoe UI Emoji" w:hAnsi="Segoe UI Emoji" w:cs="Segoe UI Emoji"/>
+        </w:rPr>
+        <w:t>reutilizaveis</w:t>
+      </w:r>
+      <w:proofErr w:type="spellEnd"/>
+      <w:r>
+        <w:rPr>
+          <w:rFonts w:ascii="Segoe UI Emoji" w:hAnsi="Segoe UI Emoji" w:cs="Segoe UI Emoji"/>
+        </w:rPr>
+        <w:t xml:space="preserve"> para todas as telas.</w:t>
       </w:r>
     </w:p>
     <w:p>
@@ -930,8 +1315,21 @@
         <w:rPr>
           <w:rFonts w:ascii="Segoe UI Emoji" w:hAnsi="Segoe UI Emoji" w:cs="Segoe UI Emoji"/>
         </w:rPr>
-        <w:lastRenderedPageBreak/>
-        <w:t>O foco desta task e a base visual e estrutural do sistema.</w:t>
+        <w:t xml:space="preserve">O foco desta </w:t>
+      </w:r>
+      <w:proofErr w:type="spellStart"/>
+      <w:r>
+        <w:rPr>
+          <w:rFonts w:ascii="Segoe UI Emoji" w:hAnsi="Segoe UI Emoji" w:cs="Segoe UI Emoji"/>
+        </w:rPr>
+        <w:t>task</w:t>
+      </w:r>
+      <w:proofErr w:type="spellEnd"/>
+      <w:r>
+        <w:rPr>
+          <w:rFonts w:ascii="Segoe UI Emoji" w:hAnsi="Segoe UI Emoji" w:cs="Segoe UI Emoji"/>
+        </w:rPr>
+        <w:t xml:space="preserve"> e a base visual e estrutural do sistema.</w:t>
       </w:r>
     </w:p>
     <w:p>
@@ -945,7 +1343,36 @@
         <w:rPr>
           <w:rFonts w:ascii="Segoe UI Emoji" w:hAnsi="Segoe UI Emoji" w:cs="Segoe UI Emoji"/>
         </w:rPr>
-        <w:t>Priorizar consistencia, acessibilidade e reutilizacao de componentes.</w:t>
+        <w:lastRenderedPageBreak/>
+        <w:t xml:space="preserve">Priorizar </w:t>
+      </w:r>
+      <w:proofErr w:type="spellStart"/>
+      <w:r>
+        <w:rPr>
+          <w:rFonts w:ascii="Segoe UI Emoji" w:hAnsi="Segoe UI Emoji" w:cs="Segoe UI Emoji"/>
+        </w:rPr>
+        <w:t>consistencia</w:t>
+      </w:r>
+      <w:proofErr w:type="spellEnd"/>
+      <w:r>
+        <w:rPr>
+          <w:rFonts w:ascii="Segoe UI Emoji" w:hAnsi="Segoe UI Emoji" w:cs="Segoe UI Emoji"/>
+        </w:rPr>
+        <w:t xml:space="preserve">, acessibilidade e </w:t>
+      </w:r>
+      <w:proofErr w:type="spellStart"/>
+      <w:r>
+        <w:rPr>
+          <w:rFonts w:ascii="Segoe UI Emoji" w:hAnsi="Segoe UI Emoji" w:cs="Segoe UI Emoji"/>
+        </w:rPr>
+        <w:t>reutilizacao</w:t>
+      </w:r>
+      <w:proofErr w:type="spellEnd"/>
+      <w:r>
+        <w:rPr>
+          <w:rFonts w:ascii="Segoe UI Emoji" w:hAnsi="Segoe UI Emoji" w:cs="Segoe UI Emoji"/>
+        </w:rPr>
+        <w:t xml:space="preserve"> de componentes.</w:t>
       </w:r>
     </w:p>
     <w:p>
@@ -959,7 +1386,63 @@
         <w:rPr>
           <w:rFonts w:ascii="Segoe UI Emoji" w:hAnsi="Segoe UI Emoji" w:cs="Segoe UI Emoji"/>
         </w:rPr>
-        <w:t>Evitar repetir referencias ja cobertas nas tasks de sistemas de prefeitura e dashboards executivas.</w:t>
+        <w:t xml:space="preserve">Evitar repetir </w:t>
+      </w:r>
+      <w:proofErr w:type="gramStart"/>
+      <w:r>
+        <w:rPr>
+          <w:rFonts w:ascii="Segoe UI Emoji" w:hAnsi="Segoe UI Emoji" w:cs="Segoe UI Emoji"/>
+        </w:rPr>
+        <w:t>referencias</w:t>
+      </w:r>
+      <w:proofErr w:type="gramEnd"/>
+      <w:r>
+        <w:rPr>
+          <w:rFonts w:ascii="Segoe UI Emoji" w:hAnsi="Segoe UI Emoji" w:cs="Segoe UI Emoji"/>
+        </w:rPr>
+        <w:t xml:space="preserve"> </w:t>
+      </w:r>
+      <w:proofErr w:type="spellStart"/>
+      <w:r>
+        <w:rPr>
+          <w:rFonts w:ascii="Segoe UI Emoji" w:hAnsi="Segoe UI Emoji" w:cs="Segoe UI Emoji"/>
+        </w:rPr>
+        <w:t>ja</w:t>
+      </w:r>
+      <w:proofErr w:type="spellEnd"/>
+      <w:r>
+        <w:rPr>
+          <w:rFonts w:ascii="Segoe UI Emoji" w:hAnsi="Segoe UI Emoji" w:cs="Segoe UI Emoji"/>
+        </w:rPr>
+        <w:t xml:space="preserve"> cobertas nas </w:t>
+      </w:r>
+      <w:proofErr w:type="spellStart"/>
+      <w:r>
+        <w:rPr>
+          <w:rFonts w:ascii="Segoe UI Emoji" w:hAnsi="Segoe UI Emoji" w:cs="Segoe UI Emoji"/>
+        </w:rPr>
+        <w:t>tasks</w:t>
+      </w:r>
+      <w:proofErr w:type="spellEnd"/>
+      <w:r>
+        <w:rPr>
+          <w:rFonts w:ascii="Segoe UI Emoji" w:hAnsi="Segoe UI Emoji" w:cs="Segoe UI Emoji"/>
+        </w:rPr>
+        <w:t xml:space="preserve"> de sistemas de prefeitura e </w:t>
+      </w:r>
+      <w:proofErr w:type="spellStart"/>
+      <w:r>
+        <w:rPr>
+          <w:rFonts w:ascii="Segoe UI Emoji" w:hAnsi="Segoe UI Emoji" w:cs="Segoe UI Emoji"/>
+        </w:rPr>
+        <w:t>dashboards</w:t>
+      </w:r>
+      <w:proofErr w:type="spellEnd"/>
+      <w:r>
+        <w:rPr>
+          <w:rFonts w:ascii="Segoe UI Emoji" w:hAnsi="Segoe UI Emoji" w:cs="Segoe UI Emoji"/>
+        </w:rPr>
+        <w:t xml:space="preserve"> executivas.</w:t>
       </w:r>
     </w:p>
     <w:p>
@@ -973,7 +1456,35 @@
         <w:rPr>
           <w:rFonts w:ascii="Segoe UI Emoji" w:hAnsi="Segoe UI Emoji" w:cs="Segoe UI Emoji"/>
         </w:rPr>
-        <w:t>O entregavel deve servir como base de evolucao transversal do produto inteiro.</w:t>
+        <w:t xml:space="preserve">O </w:t>
+      </w:r>
+      <w:proofErr w:type="spellStart"/>
+      <w:r>
+        <w:rPr>
+          <w:rFonts w:ascii="Segoe UI Emoji" w:hAnsi="Segoe UI Emoji" w:cs="Segoe UI Emoji"/>
+        </w:rPr>
+        <w:t>entregavel</w:t>
+      </w:r>
+      <w:proofErr w:type="spellEnd"/>
+      <w:r>
+        <w:rPr>
+          <w:rFonts w:ascii="Segoe UI Emoji" w:hAnsi="Segoe UI Emoji" w:cs="Segoe UI Emoji"/>
+        </w:rPr>
+        <w:t xml:space="preserve"> deve servir como base de </w:t>
+      </w:r>
+      <w:proofErr w:type="spellStart"/>
+      <w:r>
+        <w:rPr>
+          <w:rFonts w:ascii="Segoe UI Emoji" w:hAnsi="Segoe UI Emoji" w:cs="Segoe UI Emoji"/>
+        </w:rPr>
+        <w:t>evolucao</w:t>
+      </w:r>
+      <w:proofErr w:type="spellEnd"/>
+      <w:r>
+        <w:rPr>
+          <w:rFonts w:ascii="Segoe UI Emoji" w:hAnsi="Segoe UI Emoji" w:cs="Segoe UI Emoji"/>
+        </w:rPr>
+        <w:t xml:space="preserve"> transversal do produto inteiro.</w:t>
       </w:r>
     </w:p>
     <w:p>
@@ -1014,141 +1525,659 @@
                 <w:sz w:val="24"/>
                 <w:szCs w:val="24"/>
               </w:rPr>
-              <w:t>Sprint Results</w:t>
-            </w:r>
+              <w:t xml:space="preserve">Sprint </w:t>
+            </w:r>
+            <w:proofErr w:type="spellStart"/>
+            <w:r>
+              <w:rPr>
+                <w:b/>
+                <w:bCs/>
+                <w:color w:val="FFFFFF" w:themeColor="background1"/>
+                <w:sz w:val="24"/>
+                <w:szCs w:val="24"/>
+              </w:rPr>
+              <w:t>Results</w:t>
+            </w:r>
+            <w:proofErr w:type="spellEnd"/>
           </w:p>
         </w:tc>
       </w:tr>
     </w:tbl>
     <w:p>
-      <w:r>
-        <w:t>Inclui contraste mínimo, navegação por teclado, foco visível e responsividade sem perda de funcionalidade.</w:t>
-      </w:r>
+      <w:proofErr w:type="gramStart"/>
+      <w:r>
+        <w:t>Análise de Design Systems, Componentes e Acessibilidade para Sistemas Administrativos</w:t>
+      </w:r>
+      <w:r>
+        <w:t>]</w:t>
+      </w:r>
+      <w:proofErr w:type="gramEnd"/>
     </w:p>
     <w:p>
       <w:r>
-        <w:t>Recomenda-se estruturar o sistema em tokens, componentes base e padrões reutilizáveis para garantir consistência e escalabilidade.</w:t>
+        <w:t xml:space="preserve">Inclui contraste mínimo, navegação por teclado, foco visível e </w:t>
+      </w:r>
+      <w:proofErr w:type="spellStart"/>
+      <w:r>
+        <w:t>responsividade</w:t>
+      </w:r>
+      <w:proofErr w:type="spellEnd"/>
+      <w:r>
+        <w:t xml:space="preserve"> sem perda de funcionalidade.</w:t>
       </w:r>
     </w:p>
     <w:p>
       <w:r>
-        <w:rPr>
-          <w:noProof/>
-        </w:rPr>
-        <w:drawing>
-          <wp:inline distT="0" distB="0" distL="0" distR="0" wp14:anchorId="55A85E57" wp14:editId="37380F24">
-            <wp:extent cx="6126480" cy="3448981"/>
-            <wp:effectExtent l="0" t="0" r="0" b="0"/>
-            <wp:docPr id="1" name="Picture 1"/>
-            <wp:cNvGraphicFramePr>
-              <a:graphicFrameLocks xmlns:a="http://schemas.openxmlformats.org/drawingml/2006/main" noChangeAspect="1"/>
-            </wp:cNvGraphicFramePr>
-            <a:graphic xmlns:a="http://schemas.openxmlformats.org/drawingml/2006/main">
-              <a:graphicData uri="http://schemas.openxmlformats.org/drawingml/2006/picture">
-                <pic:pic xmlns:pic="http://schemas.openxmlformats.org/drawingml/2006/picture">
-                  <pic:nvPicPr>
-                    <pic:cNvPr id="0" name="material.png"/>
-                    <pic:cNvPicPr/>
-                  </pic:nvPicPr>
-                  <pic:blipFill>
-                    <a:blip r:embed="rId9"/>
-                    <a:stretch>
-                      <a:fillRect/>
-                    </a:stretch>
-                  </pic:blipFill>
-                  <pic:spPr>
-                    <a:xfrm>
-                      <a:off x="0" y="0"/>
-                      <a:ext cx="6126480" cy="3448981"/>
-                    </a:xfrm>
-                    <a:prstGeom prst="rect">
-                      <a:avLst/>
-                    </a:prstGeom>
-                  </pic:spPr>
-                </pic:pic>
-              </a:graphicData>
-            </a:graphic>
-          </wp:inline>
-        </w:drawing>
-      </w:r>
+        <w:t xml:space="preserve">Recomenda-se estruturar o sistema em </w:t>
+      </w:r>
+      <w:proofErr w:type="spellStart"/>
+      <w:r>
+        <w:t>tokens</w:t>
+      </w:r>
+      <w:proofErr w:type="spellEnd"/>
+      <w:r>
+        <w:t>, componentes base e padrões reutilizáveis para garantir consistência e escalabilidade.</w:t>
+      </w:r>
+    </w:p>
+    <w:p/>
+    <w:p>
+      <w:proofErr w:type="spellStart"/>
+      <w:r>
+        <w:t>Cards</w:t>
+      </w:r>
+      <w:proofErr w:type="spellEnd"/>
+      <w:r>
+        <w:t xml:space="preserve"> – usados para resumo e </w:t>
+      </w:r>
+      <w:proofErr w:type="spellStart"/>
+      <w:r>
+        <w:t>dashboards</w:t>
+      </w:r>
+      <w:proofErr w:type="spellEnd"/>
     </w:p>
     <w:p>
       <w:r>
-        <w:rPr>
-          <w:noProof/>
-        </w:rPr>
-        <w:drawing>
-          <wp:inline distT="0" distB="0" distL="0" distR="0" wp14:anchorId="566A1B27" wp14:editId="3FA09E14">
-            <wp:extent cx="6126480" cy="3448981"/>
-            <wp:effectExtent l="0" t="0" r="0" b="0"/>
-            <wp:docPr id="2" name="Picture 2"/>
-            <wp:cNvGraphicFramePr>
-              <a:graphicFrameLocks xmlns:a="http://schemas.openxmlformats.org/drawingml/2006/main" noChangeAspect="1"/>
-            </wp:cNvGraphicFramePr>
-            <a:graphic xmlns:a="http://schemas.openxmlformats.org/drawingml/2006/main">
-              <a:graphicData uri="http://schemas.openxmlformats.org/drawingml/2006/picture">
-                <pic:pic xmlns:pic="http://schemas.openxmlformats.org/drawingml/2006/picture">
-                  <pic:nvPicPr>
-                    <pic:cNvPr id="0" name="ant.png"/>
-                    <pic:cNvPicPr/>
-                  </pic:nvPicPr>
-                  <pic:blipFill>
-                    <a:blip r:embed="rId10"/>
-                    <a:stretch>
-                      <a:fillRect/>
-                    </a:stretch>
-                  </pic:blipFill>
-                  <pic:spPr>
-                    <a:xfrm>
-                      <a:off x="0" y="0"/>
-                      <a:ext cx="6126480" cy="3448981"/>
-                    </a:xfrm>
-                    <a:prstGeom prst="rect">
-                      <a:avLst/>
-                    </a:prstGeom>
-                  </pic:spPr>
-                </pic:pic>
-              </a:graphicData>
-            </a:graphic>
-          </wp:inline>
-        </w:drawing>
+        <w:t>Tabelas – principal componente para dados estruturados</w:t>
       </w:r>
     </w:p>
     <w:p>
       <w:r>
-        <w:t>Cards – usados para resumo e dashboards</w:t>
+        <w:t>Formulários – entrada e validação de dados</w:t>
       </w:r>
     </w:p>
     <w:p>
       <w:r>
-        <w:lastRenderedPageBreak/>
-        <w:t>Tabelas – principal componente para dados estruturados</w:t>
+        <w:t>Filtros – refinamento de dados</w:t>
       </w:r>
     </w:p>
     <w:p>
       <w:r>
-        <w:t>Formulários – entrada e validação de dados</w:t>
+        <w:t>Modais – ações críticas e confirmações</w:t>
       </w:r>
     </w:p>
     <w:p>
       <w:r>
-        <w:t>Filtros – refinamento de dados</w:t>
+        <w:t xml:space="preserve">Estados vazios – </w:t>
+      </w:r>
+      <w:proofErr w:type="gramStart"/>
+      <w:r>
+        <w:t>feedback</w:t>
+      </w:r>
+      <w:proofErr w:type="gramEnd"/>
+      <w:r>
+        <w:t xml:space="preserve"> quando não há dados</w:t>
       </w:r>
     </w:p>
     <w:p>
       <w:r>
-        <w:t>Modais – ações críticas e confirmações</w:t>
-      </w:r>
-    </w:p>
-    <w:p>
-      <w:r>
-        <w:t>Estados vazios – feedback quando não há dados</w:t>
-      </w:r>
-    </w:p>
-    <w:p>
-      <w:r>
         <w:t>Mensagens de erro – orientação ao usuário</w:t>
       </w:r>
+      <w:bookmarkStart w:id="0" w:name="_GoBack"/>
+      <w:bookmarkEnd w:id="0"/>
+      <w:r>
+        <w:br/>
+      </w:r>
+      <w:r>
+        <w:br/>
+        <w:t>1. Contextualização e Referências de Design Systems</w:t>
+      </w:r>
+      <w:r>
+        <w:br/>
+      </w:r>
+      <w:r>
+        <w:br/>
+        <w:t xml:space="preserve">Foram </w:t>
+      </w:r>
+      <w:proofErr w:type="gramStart"/>
+      <w:r>
+        <w:t>analisados</w:t>
+      </w:r>
+      <w:proofErr w:type="gramEnd"/>
+      <w:r>
+        <w:t xml:space="preserve"> design systems amplamente utilizados em sistemas administrativos e institucionais, incluindo Material Design (Google), </w:t>
+      </w:r>
+      <w:proofErr w:type="spellStart"/>
+      <w:r>
+        <w:t>Ant</w:t>
+      </w:r>
+      <w:proofErr w:type="spellEnd"/>
+      <w:r>
+        <w:t xml:space="preserve"> Design, </w:t>
+      </w:r>
+      <w:proofErr w:type="spellStart"/>
+      <w:r>
+        <w:t>Carbon</w:t>
+      </w:r>
+      <w:proofErr w:type="spellEnd"/>
+      <w:r>
+        <w:t xml:space="preserve"> Design System (IBM), </w:t>
+      </w:r>
+      <w:proofErr w:type="spellStart"/>
+      <w:r>
+        <w:t>Atlassian</w:t>
+      </w:r>
+      <w:proofErr w:type="spellEnd"/>
+      <w:r>
+        <w:t xml:space="preserve"> Design System e o Padrão Digital de Governo (</w:t>
+      </w:r>
+      <w:proofErr w:type="spellStart"/>
+      <w:r>
+        <w:t>DSGov</w:t>
+      </w:r>
+      <w:proofErr w:type="spellEnd"/>
+      <w:r>
+        <w:t>). Esses sistemas apresentam padrões consolidados para construção de interfaces complexas, com foco em consistência, escalabilidade e usabilidade.</w:t>
+      </w:r>
+      <w:r>
+        <w:br/>
+      </w:r>
+      <w:r>
+        <w:br/>
+        <w:t xml:space="preserve">Material Design enfatiza hierarquia visual, </w:t>
+      </w:r>
+      <w:proofErr w:type="gramStart"/>
+      <w:r>
+        <w:t>feedback</w:t>
+      </w:r>
+      <w:proofErr w:type="gramEnd"/>
+      <w:r>
+        <w:t xml:space="preserve"> de interação e clareza estrutural. </w:t>
+      </w:r>
+      <w:proofErr w:type="spellStart"/>
+      <w:r>
+        <w:t>Ant</w:t>
+      </w:r>
+      <w:proofErr w:type="spellEnd"/>
+      <w:r>
+        <w:t xml:space="preserve"> Design é voltado para sistemas empresariais, com forte padronização de tabelas e formulários. </w:t>
+      </w:r>
+      <w:proofErr w:type="spellStart"/>
+      <w:r>
+        <w:t>Carbon</w:t>
+      </w:r>
+      <w:proofErr w:type="spellEnd"/>
+      <w:r>
+        <w:t xml:space="preserve"> Design System prioriza acessibilidade e modularidade. </w:t>
+      </w:r>
+      <w:proofErr w:type="spellStart"/>
+      <w:r>
+        <w:t>Atlassian</w:t>
+      </w:r>
+      <w:proofErr w:type="spellEnd"/>
+      <w:r>
+        <w:t xml:space="preserve"> Design System destaca consistência e reutilização em larga escala. O </w:t>
+      </w:r>
+      <w:proofErr w:type="spellStart"/>
+      <w:proofErr w:type="gramStart"/>
+      <w:r>
+        <w:t>DSGov</w:t>
+      </w:r>
+      <w:proofErr w:type="spellEnd"/>
+      <w:proofErr w:type="gramEnd"/>
+      <w:r>
+        <w:t>, essencial para o contexto brasileiro, garante conformidade institucional e padrões governamentais.</w:t>
+      </w:r>
+      <w:r>
+        <w:br/>
+      </w:r>
+      <w:r>
+        <w:br/>
+        <w:t>2. Análise Estruturada de Componentes</w:t>
+      </w:r>
+      <w:r>
+        <w:br/>
+      </w:r>
+      <w:r>
+        <w:br/>
+      </w:r>
+      <w:proofErr w:type="spellStart"/>
+      <w:r>
+        <w:t>Cards</w:t>
+      </w:r>
+      <w:proofErr w:type="spellEnd"/>
+      <w:r>
+        <w:br/>
+      </w:r>
+      <w:proofErr w:type="spellStart"/>
+      <w:r>
+        <w:t>Cards</w:t>
+      </w:r>
+      <w:proofErr w:type="spellEnd"/>
+      <w:r>
+        <w:t xml:space="preserve"> são utilizados para apresentar informações resumidas e navegação rápida. Boas práticas incluem uso de hierarquia visual, ícones, indicadores numéricos e cores institucionais. No </w:t>
+      </w:r>
+      <w:proofErr w:type="spellStart"/>
+      <w:r>
+        <w:t>Civitas</w:t>
+      </w:r>
+      <w:proofErr w:type="spellEnd"/>
+      <w:r>
+        <w:t xml:space="preserve">, devem compor o </w:t>
+      </w:r>
+      <w:proofErr w:type="spellStart"/>
+      <w:r>
+        <w:t>dashboard</w:t>
+      </w:r>
+      <w:proofErr w:type="spellEnd"/>
+      <w:r>
+        <w:t xml:space="preserve"> inicial com indicadores como número de usuários ativos, despesas pendentes e instituições cadastradas.</w:t>
+      </w:r>
+      <w:r>
+        <w:br/>
+      </w:r>
+      <w:r>
+        <w:br/>
+        <w:t>Tabelas</w:t>
+      </w:r>
+      <w:r>
+        <w:br/>
+      </w:r>
+      <w:proofErr w:type="spellStart"/>
+      <w:r>
+        <w:t>Tabelas</w:t>
+      </w:r>
+      <w:proofErr w:type="spellEnd"/>
+      <w:r>
+        <w:t xml:space="preserve"> são o principal componente de sistemas administrativos. Devem possuir paginação, ordenação, filtros e estados (carregamento, vazio e erro). Devem seguir consistência estrutural e permitir ações rápidas. No </w:t>
+      </w:r>
+      <w:proofErr w:type="spellStart"/>
+      <w:r>
+        <w:t>Civitas</w:t>
+      </w:r>
+      <w:proofErr w:type="spellEnd"/>
+      <w:r>
+        <w:t xml:space="preserve">, devem refletir diretamente os dados da API, com uso de </w:t>
+      </w:r>
+      <w:proofErr w:type="spellStart"/>
+      <w:r>
+        <w:t>badges</w:t>
+      </w:r>
+      <w:proofErr w:type="spellEnd"/>
+      <w:r>
+        <w:t xml:space="preserve"> de status e integração com filtros.</w:t>
+      </w:r>
+      <w:r>
+        <w:br/>
+      </w:r>
+      <w:r>
+        <w:br/>
+        <w:t>Formulários</w:t>
+      </w:r>
+      <w:r>
+        <w:br/>
+      </w:r>
+      <w:proofErr w:type="spellStart"/>
+      <w:r>
+        <w:lastRenderedPageBreak/>
+        <w:t>Formulários</w:t>
+      </w:r>
+      <w:proofErr w:type="spellEnd"/>
+      <w:r>
+        <w:t xml:space="preserve"> devem ser organizados, com validação em tempo real e </w:t>
+      </w:r>
+      <w:proofErr w:type="gramStart"/>
+      <w:r>
+        <w:t>feedback</w:t>
+      </w:r>
+      <w:proofErr w:type="gramEnd"/>
+      <w:r>
+        <w:t xml:space="preserve"> claro. Boas práticas incluem agrupamento por seções, </w:t>
+      </w:r>
+      <w:proofErr w:type="spellStart"/>
+      <w:r>
+        <w:t>labels</w:t>
+      </w:r>
+      <w:proofErr w:type="spellEnd"/>
+      <w:r>
+        <w:t xml:space="preserve"> visíveis e mensagens de erro específicas. No </w:t>
+      </w:r>
+      <w:proofErr w:type="spellStart"/>
+      <w:r>
+        <w:t>Civitas</w:t>
+      </w:r>
+      <w:proofErr w:type="spellEnd"/>
+      <w:r>
+        <w:t>, recomenda-se uso de componentes reutilizáveis e padronização de validações.</w:t>
+      </w:r>
+      <w:r>
+        <w:br/>
+      </w:r>
+      <w:r>
+        <w:br/>
+        <w:t>Filtros</w:t>
+      </w:r>
+      <w:r>
+        <w:br/>
+      </w:r>
+      <w:proofErr w:type="spellStart"/>
+      <w:r>
+        <w:t>Filtros</w:t>
+      </w:r>
+      <w:proofErr w:type="spellEnd"/>
+      <w:r>
+        <w:t xml:space="preserve"> permitem refinamento de dados e devem ser simples, visíveis e eficientes. Devem incluir filtros por status, datas e categorias. No </w:t>
+      </w:r>
+      <w:proofErr w:type="spellStart"/>
+      <w:r>
+        <w:t>Civitas</w:t>
+      </w:r>
+      <w:proofErr w:type="spellEnd"/>
+      <w:r>
+        <w:t>, devem estar integrados às tabelas e atualizados em tempo real.</w:t>
+      </w:r>
+      <w:r>
+        <w:br/>
+      </w:r>
+      <w:r>
+        <w:br/>
+      </w:r>
+      <w:proofErr w:type="gramStart"/>
+      <w:r>
+        <w:t>Modais</w:t>
+      </w:r>
+      <w:proofErr w:type="gramEnd"/>
+      <w:r>
+        <w:br/>
+      </w:r>
+      <w:proofErr w:type="spellStart"/>
+      <w:r>
+        <w:t>Modais</w:t>
+      </w:r>
+      <w:proofErr w:type="spellEnd"/>
+      <w:r>
+        <w:t xml:space="preserve"> são utilizados para ações críticas, como confirmações e edições rápidas. Devem ser objetivos e evitar excesso de informação. No </w:t>
+      </w:r>
+      <w:proofErr w:type="spellStart"/>
+      <w:r>
+        <w:t>Civitas</w:t>
+      </w:r>
+      <w:proofErr w:type="spellEnd"/>
+      <w:r>
+        <w:t>, devem ser usados para exclusões e confirmações importantes.</w:t>
+      </w:r>
+      <w:r>
+        <w:br/>
+      </w:r>
+      <w:r>
+        <w:br/>
+        <w:t xml:space="preserve">Estados </w:t>
+      </w:r>
+      <w:proofErr w:type="gramStart"/>
+      <w:r>
+        <w:t>Vazios</w:t>
+      </w:r>
+      <w:proofErr w:type="gramEnd"/>
+      <w:r>
+        <w:br/>
+        <w:t xml:space="preserve">Estados vazios devem orientar o usuário, explicando a ausência de dados e sugerindo ações. No </w:t>
+      </w:r>
+      <w:proofErr w:type="spellStart"/>
+      <w:r>
+        <w:t>Civitas</w:t>
+      </w:r>
+      <w:proofErr w:type="spellEnd"/>
+      <w:r>
+        <w:t>, devem incentivar criação de novos registros.</w:t>
+      </w:r>
+      <w:r>
+        <w:br/>
+      </w:r>
+      <w:r>
+        <w:br/>
+        <w:t>Mensagens de Erro</w:t>
+      </w:r>
+      <w:r>
+        <w:br/>
+        <w:t>Mensagens de erro devem ser claras, objetivas e orientadas à solução. Devem refletir respostas da API de forma amigável.</w:t>
+      </w:r>
+      <w:r>
+        <w:br/>
+      </w:r>
+      <w:r>
+        <w:br/>
+        <w:t xml:space="preserve">3. Acessibilidade e </w:t>
+      </w:r>
+      <w:proofErr w:type="spellStart"/>
+      <w:r>
+        <w:t>Responsividade</w:t>
+      </w:r>
+      <w:proofErr w:type="spellEnd"/>
+      <w:r>
+        <w:br/>
+      </w:r>
+      <w:r>
+        <w:br/>
+        <w:t>Todos os componentes devem seguir diretrizes WCAG:</w:t>
+      </w:r>
+      <w:r>
+        <w:br/>
+        <w:t>- Contraste adequado</w:t>
+      </w:r>
+      <w:r>
+        <w:br/>
+        <w:t>- Navegação por teclado</w:t>
+      </w:r>
+      <w:r>
+        <w:br/>
+        <w:t>- Estados visuais (</w:t>
+      </w:r>
+      <w:proofErr w:type="spellStart"/>
+      <w:r>
+        <w:t>hover</w:t>
+      </w:r>
+      <w:proofErr w:type="spellEnd"/>
+      <w:r>
+        <w:t xml:space="preserve">, </w:t>
+      </w:r>
+      <w:proofErr w:type="spellStart"/>
+      <w:r>
+        <w:t>focus</w:t>
+      </w:r>
+      <w:proofErr w:type="spellEnd"/>
+      <w:r>
+        <w:t xml:space="preserve">, </w:t>
+      </w:r>
+      <w:proofErr w:type="spellStart"/>
+      <w:r>
+        <w:t>active</w:t>
+      </w:r>
+      <w:proofErr w:type="spellEnd"/>
+      <w:proofErr w:type="gramStart"/>
+      <w:r>
+        <w:t>)</w:t>
+      </w:r>
+      <w:proofErr w:type="gramEnd"/>
+      <w:r>
+        <w:br/>
+        <w:t>- Compatibilidade com leitores de tela</w:t>
+      </w:r>
+      <w:r>
+        <w:br/>
+      </w:r>
+      <w:r>
+        <w:br/>
+      </w:r>
+      <w:proofErr w:type="spellStart"/>
+      <w:r>
+        <w:t>Responsividade</w:t>
+      </w:r>
+      <w:proofErr w:type="spellEnd"/>
+      <w:r>
+        <w:t xml:space="preserve"> deve garantir funcionamento em diferentes dispositivos, com adaptação de layout, menus e tabelas.</w:t>
+      </w:r>
+      <w:r>
+        <w:br/>
+      </w:r>
+      <w:r>
+        <w:br/>
+        <w:t xml:space="preserve">4. Aplicação no Projeto </w:t>
+      </w:r>
+      <w:proofErr w:type="spellStart"/>
+      <w:r>
+        <w:t>Civitas</w:t>
+      </w:r>
+      <w:proofErr w:type="spellEnd"/>
+      <w:r>
+        <w:br/>
+      </w:r>
+      <w:r>
+        <w:br/>
+        <w:t xml:space="preserve">O </w:t>
+      </w:r>
+      <w:proofErr w:type="spellStart"/>
+      <w:r>
+        <w:t>Civitas</w:t>
+      </w:r>
+      <w:proofErr w:type="spellEnd"/>
+      <w:r>
+        <w:t xml:space="preserve"> deve adotar uma abordagem baseada em design system:</w:t>
+      </w:r>
+      <w:r>
+        <w:br/>
+        <w:t>- Criação de biblioteca de componentes reutilizáveis</w:t>
+      </w:r>
+      <w:r>
+        <w:br/>
+        <w:t xml:space="preserve">- Uso de </w:t>
+      </w:r>
+      <w:proofErr w:type="spellStart"/>
+      <w:r>
+        <w:t>tokens</w:t>
+      </w:r>
+      <w:proofErr w:type="spellEnd"/>
+      <w:r>
+        <w:t xml:space="preserve"> de design (cores, tipografia, espaçamento</w:t>
+      </w:r>
+      <w:proofErr w:type="gramStart"/>
+      <w:r>
+        <w:t>)</w:t>
+      </w:r>
+      <w:proofErr w:type="gramEnd"/>
+      <w:r>
+        <w:br/>
+        <w:t>- Padronização de layouts</w:t>
+      </w:r>
+      <w:r>
+        <w:br/>
+        <w:t>- Integração com a arquitetura existente (</w:t>
+      </w:r>
+      <w:proofErr w:type="spellStart"/>
+      <w:r>
+        <w:t>frontend</w:t>
+      </w:r>
+      <w:proofErr w:type="spellEnd"/>
+      <w:r>
+        <w:t xml:space="preserve"> e </w:t>
+      </w:r>
+      <w:proofErr w:type="spellStart"/>
+      <w:r>
+        <w:t>backend</w:t>
+      </w:r>
+      <w:proofErr w:type="spellEnd"/>
+      <w:r>
+        <w:t>)</w:t>
+      </w:r>
+      <w:r>
+        <w:br/>
+      </w:r>
+      <w:r>
+        <w:br/>
+        <w:t>5. Proposta Global de UX/UI</w:t>
+      </w:r>
+      <w:r>
+        <w:br/>
+      </w:r>
+      <w:r>
+        <w:br/>
+        <w:t>- Padronização visual baseada em contexto institucional</w:t>
+      </w:r>
+      <w:r>
+        <w:br/>
+        <w:t>- Consistência entre telas e componentes</w:t>
+      </w:r>
+      <w:r>
+        <w:br/>
+        <w:t>- Reutilização de componentes para escalabilidade</w:t>
+      </w:r>
+      <w:r>
+        <w:br/>
+        <w:t xml:space="preserve">- </w:t>
+      </w:r>
+      <w:proofErr w:type="gramStart"/>
+      <w:r>
+        <w:t>Feedback</w:t>
+      </w:r>
+      <w:proofErr w:type="gramEnd"/>
+      <w:r>
+        <w:t xml:space="preserve"> claro para o usuário</w:t>
+      </w:r>
+      <w:r>
+        <w:br/>
+        <w:t xml:space="preserve">- </w:t>
+      </w:r>
+      <w:proofErr w:type="spellStart"/>
+      <w:r>
+        <w:t>Dashboard</w:t>
+      </w:r>
+      <w:proofErr w:type="spellEnd"/>
+      <w:r>
+        <w:t xml:space="preserve"> com foco em produtividade</w:t>
+      </w:r>
+      <w:r>
+        <w:br/>
+      </w:r>
+      <w:r>
+        <w:br/>
+        <w:t>6. Conclusão</w:t>
+      </w:r>
+      <w:r>
+        <w:br/>
+      </w:r>
+      <w:r>
+        <w:br/>
+        <w:t xml:space="preserve">A adoção de design systems estruturados permitirá ao </w:t>
+      </w:r>
+      <w:proofErr w:type="spellStart"/>
+      <w:r>
+        <w:t>Civitas</w:t>
+      </w:r>
+      <w:proofErr w:type="spellEnd"/>
+      <w:r>
+        <w:t xml:space="preserve"> evoluir como um sistema consistente, escalável e alinhado às necessidades de sistemas administrativos e governamentais. A padronização de componentes, aliada à acessibilidade e </w:t>
+      </w:r>
+      <w:proofErr w:type="spellStart"/>
+      <w:r>
+        <w:t>responsividade</w:t>
+      </w:r>
+      <w:proofErr w:type="spellEnd"/>
+      <w:r>
+        <w:t>, garante melhor experiência ao usuário e maior eficiência no desenvolvimento.</w:t>
+      </w:r>
+      <w:proofErr w:type="gramStart"/>
+      <w:r>
+        <w:br/>
+      </w:r>
+      <w:proofErr w:type="gramEnd"/>
     </w:p>
     <w:p>
       <w:pPr>
@@ -1185,7 +2214,7 @@
 </file>
 
 <file path=word/endnotes.xml><?xml version="1.0" encoding="utf-8"?>
-<w:endnotes xmlns:wpc="http://schemas.microsoft.com/office/word/2010/wordprocessingCanvas" xmlns:cx="http://schemas.microsoft.com/office/drawing/2014/chartex" xmlns:cx1="http://schemas.microsoft.com/office/drawing/2015/9/8/chartex" xmlns:cx2="http://schemas.microsoft.com/office/drawing/2015/10/21/chartex" xmlns:cx3="http://schemas.microsoft.com/office/drawing/2016/5/9/chartex" xmlns:cx4="http://schemas.microsoft.com/office/drawing/2016/5/10/chartex" xmlns:cx5="http://schemas.microsoft.com/office/drawing/2016/5/11/chartex" xmlns:cx6="http://schemas.microsoft.com/office/drawing/2016/5/12/chartex" xmlns:cx7="http://schemas.microsoft.com/office/drawing/2016/5/13/chartex" xmlns:cx8="http://schemas.microsoft.com/office/drawing/2016/5/14/chartex" xmlns:mc="http://schemas.openxmlformats.org/markup-compatibility/2006" xmlns:aink="http://schemas.microsoft.com/office/drawing/2016/ink" xmlns:am3d="http://schemas.microsoft.com/office/drawing/2017/model3d" xmlns:o="urn:schemas-microsoft-com:office:office" xmlns:oel="http://schemas.microsoft.com/office/2019/extlst" xmlns:r="http://schemas.openxmlformats.org/officeDocument/2006/relationships" xmlns:m="http://schemas.openxmlformats.org/officeDocument/2006/math" xmlns:v="urn:schemas-microsoft-com:vml" xmlns:wp14="http://schemas.microsoft.com/office/word/2010/wordprocessingDrawing" xmlns:wp="http://schemas.openxmlformats.org/drawingml/2006/wordprocessingDrawing" xmlns:w10="urn:schemas-microsoft-com:office:word" xmlns:w="http://schemas.openxmlformats.org/wordprocessingml/2006/main" xmlns:w14="http://schemas.microsoft.com/office/word/2010/wordml" xmlns:w15="http://schemas.microsoft.com/office/word/2012/wordml" xmlns:w16cex="http://schemas.microsoft.com/office/word/2018/wordml/cex" xmlns:w16cid="http://schemas.microsoft.com/office/word/2016/wordml/cid" xmlns:w16="http://schemas.microsoft.com/office/word/2018/wordml" xmlns:w16sdtdh="http://schemas.microsoft.com/office/word/2020/wordml/sdtdatahash" xmlns:w16se="http://schemas.microsoft.com/office/word/2015/wordml/symex" xmlns:wpg="http://schemas.microsoft.com/office/word/2010/wordprocessingGroup" xmlns:wpi="http://schemas.microsoft.com/office/word/2010/wordprocessingInk" xmlns:wne="http://schemas.microsoft.com/office/word/2006/wordml" xmlns:wps="http://schemas.microsoft.com/office/word/2010/wordprocessingShape" mc:Ignorable="w14 w15 w16se w16cid w16 w16cex w16sdtdh wp14">
+<w:endnotes xmlns:wpc="http://schemas.microsoft.com/office/word/2010/wordprocessingCanvas" xmlns:mc="http://schemas.openxmlformats.org/markup-compatibility/2006" xmlns:o="urn:schemas-microsoft-com:office:office" xmlns:r="http://schemas.openxmlformats.org/officeDocument/2006/relationships" xmlns:m="http://schemas.openxmlformats.org/officeDocument/2006/math" xmlns:v="urn:schemas-microsoft-com:vml" xmlns:wp14="http://schemas.microsoft.com/office/word/2010/wordprocessingDrawing" xmlns:wp="http://schemas.openxmlformats.org/drawingml/2006/wordprocessingDrawing" xmlns:w10="urn:schemas-microsoft-com:office:word" xmlns:w="http://schemas.openxmlformats.org/wordprocessingml/2006/main" xmlns:w14="http://schemas.microsoft.com/office/word/2010/wordml" xmlns:wpg="http://schemas.microsoft.com/office/word/2010/wordprocessingGroup" xmlns:wpi="http://schemas.microsoft.com/office/word/2010/wordprocessingInk" xmlns:wne="http://schemas.microsoft.com/office/word/2006/wordml" xmlns:wps="http://schemas.microsoft.com/office/word/2010/wordprocessingShape" mc:Ignorable="w14 wp14">
   <w:endnote w:type="separator" w:id="-1">
     <w:p>
       <w:pPr>
@@ -1210,7 +2239,7 @@
 </file>
 
 <file path=word/footnotes.xml><?xml version="1.0" encoding="utf-8"?>
-<w:footnotes xmlns:wpc="http://schemas.microsoft.com/office/word/2010/wordprocessingCanvas" xmlns:cx="http://schemas.microsoft.com/office/drawing/2014/chartex" xmlns:cx1="http://schemas.microsoft.com/office/drawing/2015/9/8/chartex" xmlns:cx2="http://schemas.microsoft.com/office/drawing/2015/10/21/chartex" xmlns:cx3="http://schemas.microsoft.com/office/drawing/2016/5/9/chartex" xmlns:cx4="http://schemas.microsoft.com/office/drawing/2016/5/10/chartex" xmlns:cx5="http://schemas.microsoft.com/office/drawing/2016/5/11/chartex" xmlns:cx6="http://schemas.microsoft.com/office/drawing/2016/5/12/chartex" xmlns:cx7="http://schemas.microsoft.com/office/drawing/2016/5/13/chartex" xmlns:cx8="http://schemas.microsoft.com/office/drawing/2016/5/14/chartex" xmlns:mc="http://schemas.openxmlformats.org/markup-compatibility/2006" xmlns:aink="http://schemas.microsoft.com/office/drawing/2016/ink" xmlns:am3d="http://schemas.microsoft.com/office/drawing/2017/model3d" xmlns:o="urn:schemas-microsoft-com:office:office" xmlns:oel="http://schemas.microsoft.com/office/2019/extlst" xmlns:r="http://schemas.openxmlformats.org/officeDocument/2006/relationships" xmlns:m="http://schemas.openxmlformats.org/officeDocument/2006/math" xmlns:v="urn:schemas-microsoft-com:vml" xmlns:wp14="http://schemas.microsoft.com/office/word/2010/wordprocessingDrawing" xmlns:wp="http://schemas.openxmlformats.org/drawingml/2006/wordprocessingDrawing" xmlns:w10="urn:schemas-microsoft-com:office:word" xmlns:w="http://schemas.openxmlformats.org/wordprocessingml/2006/main" xmlns:w14="http://schemas.microsoft.com/office/word/2010/wordml" xmlns:w15="http://schemas.microsoft.com/office/word/2012/wordml" xmlns:w16cex="http://schemas.microsoft.com/office/word/2018/wordml/cex" xmlns:w16cid="http://schemas.microsoft.com/office/word/2016/wordml/cid" xmlns:w16="http://schemas.microsoft.com/office/word/2018/wordml" xmlns:w16sdtdh="http://schemas.microsoft.com/office/word/2020/wordml/sdtdatahash" xmlns:w16se="http://schemas.microsoft.com/office/word/2015/wordml/symex" xmlns:wpg="http://schemas.microsoft.com/office/word/2010/wordprocessingGroup" xmlns:wpi="http://schemas.microsoft.com/office/word/2010/wordprocessingInk" xmlns:wne="http://schemas.microsoft.com/office/word/2006/wordml" xmlns:wps="http://schemas.microsoft.com/office/word/2010/wordprocessingShape" mc:Ignorable="w14 w15 w16se w16cid w16 w16cex w16sdtdh wp14">
+<w:footnotes xmlns:wpc="http://schemas.microsoft.com/office/word/2010/wordprocessingCanvas" xmlns:mc="http://schemas.openxmlformats.org/markup-compatibility/2006" xmlns:o="urn:schemas-microsoft-com:office:office" xmlns:r="http://schemas.openxmlformats.org/officeDocument/2006/relationships" xmlns:m="http://schemas.openxmlformats.org/officeDocument/2006/math" xmlns:v="urn:schemas-microsoft-com:vml" xmlns:wp14="http://schemas.microsoft.com/office/word/2010/wordprocessingDrawing" xmlns:wp="http://schemas.openxmlformats.org/drawingml/2006/wordprocessingDrawing" xmlns:w10="urn:schemas-microsoft-com:office:word" xmlns:w="http://schemas.openxmlformats.org/wordprocessingml/2006/main" xmlns:w14="http://schemas.microsoft.com/office/word/2010/wordml" xmlns:wpg="http://schemas.microsoft.com/office/word/2010/wordprocessingGroup" xmlns:wpi="http://schemas.microsoft.com/office/word/2010/wordprocessingInk" xmlns:wne="http://schemas.microsoft.com/office/word/2006/wordml" xmlns:wps="http://schemas.microsoft.com/office/word/2010/wordprocessingShape" mc:Ignorable="w14 wp14">
   <w:footnote w:type="separator" w:id="-1">
     <w:p>
       <w:pPr>
@@ -1235,8 +2264,8 @@
 </file>
 
 <file path=word/numbering.xml><?xml version="1.0" encoding="utf-8"?>
-<w:numbering xmlns:wpc="http://schemas.microsoft.com/office/word/2010/wordprocessingCanvas" xmlns:cx="http://schemas.microsoft.com/office/drawing/2014/chartex" xmlns:cx1="http://schemas.microsoft.com/office/drawing/2015/9/8/chartex" xmlns:cx2="http://schemas.microsoft.com/office/drawing/2015/10/21/chartex" xmlns:cx3="http://schemas.microsoft.com/office/drawing/2016/5/9/chartex" xmlns:cx4="http://schemas.microsoft.com/office/drawing/2016/5/10/chartex" xmlns:cx5="http://schemas.microsoft.com/office/drawing/2016/5/11/chartex" xmlns:cx6="http://schemas.microsoft.com/office/drawing/2016/5/12/chartex" xmlns:cx7="http://schemas.microsoft.com/office/drawing/2016/5/13/chartex" xmlns:cx8="http://schemas.microsoft.com/office/drawing/2016/5/14/chartex" xmlns:mc="http://schemas.openxmlformats.org/markup-compatibility/2006" xmlns:aink="http://schemas.microsoft.com/office/drawing/2016/ink" xmlns:am3d="http://schemas.microsoft.com/office/drawing/2017/model3d" xmlns:o="urn:schemas-microsoft-com:office:office" xmlns:oel="http://schemas.microsoft.com/office/2019/extlst" xmlns:r="http://schemas.openxmlformats.org/officeDocument/2006/relationships" xmlns:m="http://schemas.openxmlformats.org/officeDocument/2006/math" xmlns:v="urn:schemas-microsoft-com:vml" xmlns:wp14="http://schemas.microsoft.com/office/word/2010/wordprocessingDrawing" xmlns:wp="http://schemas.openxmlformats.org/drawingml/2006/wordprocessingDrawing" xmlns:w10="urn:schemas-microsoft-com:office:word" xmlns:w="http://schemas.openxmlformats.org/wordprocessingml/2006/main" xmlns:w14="http://schemas.microsoft.com/office/word/2010/wordml" xmlns:w15="http://schemas.microsoft.com/office/word/2012/wordml" xmlns:w16cex="http://schemas.microsoft.com/office/word/2018/wordml/cex" xmlns:w16cid="http://schemas.microsoft.com/office/word/2016/wordml/cid" xmlns:w16="http://schemas.microsoft.com/office/word/2018/wordml" xmlns:w16sdtdh="http://schemas.microsoft.com/office/word/2020/wordml/sdtdatahash" xmlns:w16se="http://schemas.microsoft.com/office/word/2015/wordml/symex" xmlns:wpg="http://schemas.microsoft.com/office/word/2010/wordprocessingGroup" xmlns:wpi="http://schemas.microsoft.com/office/word/2010/wordprocessingInk" xmlns:wne="http://schemas.microsoft.com/office/word/2006/wordml" xmlns:wps="http://schemas.microsoft.com/office/word/2010/wordprocessingShape" mc:Ignorable="w14 w15 w16se w16cid w16 w16cex w16sdtdh wp14">
-  <w:abstractNum w:abstractNumId="0" w15:restartNumberingAfterBreak="0">
+<w:numbering xmlns:wpc="http://schemas.microsoft.com/office/word/2010/wordprocessingCanvas" xmlns:mc="http://schemas.openxmlformats.org/markup-compatibility/2006" xmlns:o="urn:schemas-microsoft-com:office:office" xmlns:r="http://schemas.openxmlformats.org/officeDocument/2006/relationships" xmlns:m="http://schemas.openxmlformats.org/officeDocument/2006/math" xmlns:v="urn:schemas-microsoft-com:vml" xmlns:wp14="http://schemas.microsoft.com/office/word/2010/wordprocessingDrawing" xmlns:wp="http://schemas.openxmlformats.org/drawingml/2006/wordprocessingDrawing" xmlns:w10="urn:schemas-microsoft-com:office:word" xmlns:w="http://schemas.openxmlformats.org/wordprocessingml/2006/main" xmlns:w14="http://schemas.microsoft.com/office/word/2010/wordml" xmlns:wpg="http://schemas.microsoft.com/office/word/2010/wordprocessingGroup" xmlns:wpi="http://schemas.microsoft.com/office/word/2010/wordprocessingInk" xmlns:wne="http://schemas.microsoft.com/office/word/2006/wordml" xmlns:wps="http://schemas.microsoft.com/office/word/2010/wordprocessingShape" mc:Ignorable="w14 wp14">
+  <w:abstractNum w:abstractNumId="0">
     <w:nsid w:val="0DDF46A5"/>
     <w:multiLevelType w:val="multilevel"/>
     <w:tmpl w:val="FC2CD0C6"/>
@@ -1385,7 +2414,7 @@
       </w:rPr>
     </w:lvl>
   </w:abstractNum>
-  <w:abstractNum w:abstractNumId="1" w15:restartNumberingAfterBreak="0">
+  <w:abstractNum w:abstractNumId="1">
     <w:nsid w:val="6B4636EC"/>
     <w:multiLevelType w:val="multilevel"/>
     <w:tmpl w:val="8ABA67D0"/>
@@ -1534,17 +2563,17 @@
       </w:rPr>
     </w:lvl>
   </w:abstractNum>
-  <w:num w:numId="1" w16cid:durableId="1896578769">
+  <w:num w:numId="1">
     <w:abstractNumId w:val="0"/>
   </w:num>
-  <w:num w:numId="2" w16cid:durableId="381296156">
+  <w:num w:numId="2">
     <w:abstractNumId w:val="1"/>
   </w:num>
 </w:numbering>
 </file>
 
 <file path=word/styles.xml><?xml version="1.0" encoding="utf-8"?>
-<w:styles xmlns:mc="http://schemas.openxmlformats.org/markup-compatibility/2006" xmlns:r="http://schemas.openxmlformats.org/officeDocument/2006/relationships" xmlns:w="http://schemas.openxmlformats.org/wordprocessingml/2006/main" xmlns:w14="http://schemas.microsoft.com/office/word/2010/wordml" xmlns:w15="http://schemas.microsoft.com/office/word/2012/wordml" xmlns:w16cex="http://schemas.microsoft.com/office/word/2018/wordml/cex" xmlns:w16cid="http://schemas.microsoft.com/office/word/2016/wordml/cid" xmlns:w16="http://schemas.microsoft.com/office/word/2018/wordml" xmlns:w16sdtdh="http://schemas.microsoft.com/office/word/2020/wordml/sdtdatahash" xmlns:w16se="http://schemas.microsoft.com/office/word/2015/wordml/symex" mc:Ignorable="w14 w15 w16se w16cid w16 w16cex w16sdtdh">
+<w:styles xmlns:mc="http://schemas.openxmlformats.org/markup-compatibility/2006" xmlns:r="http://schemas.openxmlformats.org/officeDocument/2006/relationships" xmlns:w="http://schemas.openxmlformats.org/wordprocessingml/2006/main" xmlns:w14="http://schemas.microsoft.com/office/word/2010/wordml" mc:Ignorable="w14">
   <w:docDefaults>
     <w:rPrDefault>
       <w:rPr>
@@ -1562,383 +2591,144 @@
       </w:pPr>
     </w:pPrDefault>
   </w:docDefaults>
-  <w:latentStyles w:defLockedState="0" w:defUIPriority="99" w:defSemiHidden="0" w:defUnhideWhenUsed="0" w:defQFormat="0" w:count="376">
-    <w:lsdException w:name="Normal" w:uiPriority="0" w:qFormat="1"/>
-    <w:lsdException w:name="heading 1" w:uiPriority="9" w:qFormat="1"/>
-    <w:lsdException w:name="heading 2" w:semiHidden="1" w:uiPriority="9" w:unhideWhenUsed="1" w:qFormat="1"/>
-    <w:lsdException w:name="heading 3" w:semiHidden="1" w:uiPriority="9" w:unhideWhenUsed="1" w:qFormat="1"/>
-    <w:lsdException w:name="heading 4" w:semiHidden="1" w:uiPriority="9" w:unhideWhenUsed="1" w:qFormat="1"/>
-    <w:lsdException w:name="heading 5" w:semiHidden="1" w:uiPriority="9" w:unhideWhenUsed="1" w:qFormat="1"/>
-    <w:lsdException w:name="heading 6" w:semiHidden="1" w:uiPriority="9" w:unhideWhenUsed="1" w:qFormat="1"/>
-    <w:lsdException w:name="heading 7" w:semiHidden="1" w:uiPriority="9" w:unhideWhenUsed="1" w:qFormat="1"/>
-    <w:lsdException w:name="heading 8" w:semiHidden="1" w:uiPriority="9" w:unhideWhenUsed="1" w:qFormat="1"/>
-    <w:lsdException w:name="heading 9" w:semiHidden="1" w:uiPriority="9" w:unhideWhenUsed="1" w:qFormat="1"/>
-    <w:lsdException w:name="index 1" w:semiHidden="1" w:unhideWhenUsed="1"/>
-    <w:lsdException w:name="index 2" w:semiHidden="1" w:unhideWhenUsed="1"/>
-    <w:lsdException w:name="index 3" w:semiHidden="1" w:unhideWhenUsed="1"/>
-    <w:lsdException w:name="index 4" w:semiHidden="1" w:unhideWhenUsed="1"/>
-    <w:lsdException w:name="index 5" w:semiHidden="1" w:unhideWhenUsed="1"/>
-    <w:lsdException w:name="index 6" w:semiHidden="1" w:unhideWhenUsed="1"/>
-    <w:lsdException w:name="index 7" w:semiHidden="1" w:unhideWhenUsed="1"/>
-    <w:lsdException w:name="index 8" w:semiHidden="1" w:unhideWhenUsed="1"/>
-    <w:lsdException w:name="index 9" w:semiHidden="1" w:unhideWhenUsed="1"/>
-    <w:lsdException w:name="toc 1" w:semiHidden="1" w:uiPriority="39" w:unhideWhenUsed="1"/>
-    <w:lsdException w:name="toc 2" w:semiHidden="1" w:uiPriority="39" w:unhideWhenUsed="1"/>
-    <w:lsdException w:name="toc 3" w:semiHidden="1" w:uiPriority="39" w:unhideWhenUsed="1"/>
-    <w:lsdException w:name="toc 4" w:semiHidden="1" w:uiPriority="39" w:unhideWhenUsed="1"/>
-    <w:lsdException w:name="toc 5" w:semiHidden="1" w:uiPriority="39" w:unhideWhenUsed="1"/>
-    <w:lsdException w:name="toc 6" w:semiHidden="1" w:uiPriority="39" w:unhideWhenUsed="1"/>
-    <w:lsdException w:name="toc 7" w:semiHidden="1" w:uiPriority="39" w:unhideWhenUsed="1"/>
-    <w:lsdException w:name="toc 8" w:semiHidden="1" w:uiPriority="39" w:unhideWhenUsed="1"/>
-    <w:lsdException w:name="toc 9" w:semiHidden="1" w:uiPriority="39" w:unhideWhenUsed="1"/>
-    <w:lsdException w:name="Normal Indent" w:semiHidden="1" w:unhideWhenUsed="1"/>
-    <w:lsdException w:name="footnote text" w:semiHidden="1" w:unhideWhenUsed="1"/>
-    <w:lsdException w:name="annotation text" w:semiHidden="1" w:unhideWhenUsed="1"/>
-    <w:lsdException w:name="header" w:semiHidden="1" w:unhideWhenUsed="1"/>
-    <w:lsdException w:name="footer" w:semiHidden="1" w:unhideWhenUsed="1"/>
-    <w:lsdException w:name="index heading" w:semiHidden="1" w:unhideWhenUsed="1"/>
-    <w:lsdException w:name="caption" w:semiHidden="1" w:uiPriority="35" w:unhideWhenUsed="1" w:qFormat="1"/>
-    <w:lsdException w:name="table of figures" w:semiHidden="1" w:unhideWhenUsed="1"/>
-    <w:lsdException w:name="envelope address" w:semiHidden="1" w:unhideWhenUsed="1"/>
-    <w:lsdException w:name="envelope return" w:semiHidden="1" w:unhideWhenUsed="1"/>
-    <w:lsdException w:name="footnote reference" w:semiHidden="1" w:unhideWhenUsed="1"/>
-    <w:lsdException w:name="annotation reference" w:semiHidden="1" w:unhideWhenUsed="1"/>
-    <w:lsdException w:name="line number" w:semiHidden="1" w:unhideWhenUsed="1"/>
-    <w:lsdException w:name="page number" w:semiHidden="1" w:unhideWhenUsed="1"/>
-    <w:lsdException w:name="endnote reference" w:semiHidden="1" w:unhideWhenUsed="1"/>
-    <w:lsdException w:name="endnote text" w:semiHidden="1" w:unhideWhenUsed="1"/>
-    <w:lsdException w:name="table of authorities" w:semiHidden="1" w:unhideWhenUsed="1"/>
-    <w:lsdException w:name="macro" w:semiHidden="1" w:unhideWhenUsed="1"/>
-    <w:lsdException w:name="toa heading" w:semiHidden="1" w:unhideWhenUsed="1"/>
-    <w:lsdException w:name="List" w:semiHidden="1" w:unhideWhenUsed="1"/>
-    <w:lsdException w:name="List Bullet" w:semiHidden="1" w:unhideWhenUsed="1"/>
-    <w:lsdException w:name="List Number" w:semiHidden="1" w:unhideWhenUsed="1"/>
-    <w:lsdException w:name="List 2" w:semiHidden="1" w:unhideWhenUsed="1"/>
-    <w:lsdException w:name="List 3" w:semiHidden="1" w:unhideWhenUsed="1"/>
-    <w:lsdException w:name="List 4" w:semiHidden="1" w:unhideWhenUsed="1"/>
-    <w:lsdException w:name="List 5" w:semiHidden="1" w:unhideWhenUsed="1"/>
-    <w:lsdException w:name="List Bullet 2" w:semiHidden="1" w:unhideWhenUsed="1"/>
-    <w:lsdException w:name="List Bullet 3" w:semiHidden="1" w:unhideWhenUsed="1"/>
-    <w:lsdException w:name="List Bullet 4" w:semiHidden="1" w:unhideWhenUsed="1"/>
-    <w:lsdException w:name="List Bullet 5" w:semiHidden="1" w:unhideWhenUsed="1"/>
-    <w:lsdException w:name="List Number 2" w:semiHidden="1" w:unhideWhenUsed="1"/>
-    <w:lsdException w:name="List Number 3" w:semiHidden="1" w:unhideWhenUsed="1"/>
-    <w:lsdException w:name="List Number 4" w:semiHidden="1" w:unhideWhenUsed="1"/>
-    <w:lsdException w:name="List Number 5" w:semiHidden="1" w:unhideWhenUsed="1"/>
-    <w:lsdException w:name="Title" w:uiPriority="10" w:qFormat="1"/>
-    <w:lsdException w:name="Closing" w:semiHidden="1" w:unhideWhenUsed="1"/>
-    <w:lsdException w:name="Signature" w:semiHidden="1" w:unhideWhenUsed="1"/>
-    <w:lsdException w:name="Default Paragraph Font" w:semiHidden="1" w:uiPriority="1" w:unhideWhenUsed="1"/>
-    <w:lsdException w:name="Body Text" w:semiHidden="1" w:unhideWhenUsed="1"/>
-    <w:lsdException w:name="Body Text Indent" w:semiHidden="1" w:unhideWhenUsed="1"/>
-    <w:lsdException w:name="List Continue" w:semiHidden="1" w:unhideWhenUsed="1"/>
-    <w:lsdException w:name="List Continue 2" w:semiHidden="1" w:unhideWhenUsed="1"/>
-    <w:lsdException w:name="List Continue 3" w:semiHidden="1" w:unhideWhenUsed="1"/>
-    <w:lsdException w:name="List Continue 4" w:semiHidden="1" w:unhideWhenUsed="1"/>
-    <w:lsdException w:name="List Continue 5" w:semiHidden="1" w:unhideWhenUsed="1"/>
-    <w:lsdException w:name="Message Header" w:semiHidden="1" w:unhideWhenUsed="1"/>
-    <w:lsdException w:name="Subtitle" w:uiPriority="11" w:qFormat="1"/>
-    <w:lsdException w:name="Salutation" w:semiHidden="1" w:unhideWhenUsed="1"/>
-    <w:lsdException w:name="Date" w:semiHidden="1" w:unhideWhenUsed="1"/>
-    <w:lsdException w:name="Body Text First Indent" w:semiHidden="1" w:unhideWhenUsed="1"/>
-    <w:lsdException w:name="Body Text First Indent 2" w:semiHidden="1" w:unhideWhenUsed="1"/>
-    <w:lsdException w:name="Note Heading" w:semiHidden="1" w:unhideWhenUsed="1"/>
-    <w:lsdException w:name="Body Text 2" w:semiHidden="1" w:unhideWhenUsed="1"/>
-    <w:lsdException w:name="Body Text 3" w:semiHidden="1" w:unhideWhenUsed="1"/>
-    <w:lsdException w:name="Body Text Indent 2" w:semiHidden="1" w:unhideWhenUsed="1"/>
-    <w:lsdException w:name="Body Text Indent 3" w:semiHidden="1" w:unhideWhenUsed="1"/>
-    <w:lsdException w:name="Block Text" w:semiHidden="1" w:unhideWhenUsed="1"/>
-    <w:lsdException w:name="Hyperlink" w:semiHidden="1" w:unhideWhenUsed="1"/>
-    <w:lsdException w:name="FollowedHyperlink" w:semiHidden="1" w:unhideWhenUsed="1"/>
-    <w:lsdException w:name="Strong" w:uiPriority="22" w:qFormat="1"/>
-    <w:lsdException w:name="Emphasis" w:uiPriority="20" w:qFormat="1"/>
-    <w:lsdException w:name="Document Map" w:semiHidden="1" w:unhideWhenUsed="1"/>
-    <w:lsdException w:name="Plain Text" w:semiHidden="1" w:unhideWhenUsed="1"/>
-    <w:lsdException w:name="E-mail Signature" w:semiHidden="1" w:unhideWhenUsed="1"/>
-    <w:lsdException w:name="HTML Top of Form" w:semiHidden="1" w:unhideWhenUsed="1"/>
-    <w:lsdException w:name="HTML Bottom of Form" w:semiHidden="1" w:unhideWhenUsed="1"/>
-    <w:lsdException w:name="Normal (Web)" w:semiHidden="1" w:unhideWhenUsed="1"/>
-    <w:lsdException w:name="HTML Acronym" w:semiHidden="1" w:unhideWhenUsed="1"/>
-    <w:lsdException w:name="HTML Address" w:semiHidden="1" w:unhideWhenUsed="1"/>
-    <w:lsdException w:name="HTML Cite" w:semiHidden="1" w:unhideWhenUsed="1"/>
-    <w:lsdException w:name="HTML Code" w:semiHidden="1" w:unhideWhenUsed="1"/>
-    <w:lsdException w:name="HTML Definition" w:semiHidden="1" w:unhideWhenUsed="1"/>
-    <w:lsdException w:name="HTML Keyboard" w:semiHidden="1" w:unhideWhenUsed="1"/>
-    <w:lsdException w:name="HTML Preformatted" w:semiHidden="1" w:unhideWhenUsed="1"/>
-    <w:lsdException w:name="HTML Sample" w:semiHidden="1" w:unhideWhenUsed="1"/>
-    <w:lsdException w:name="HTML Typewriter" w:semiHidden="1" w:unhideWhenUsed="1"/>
-    <w:lsdException w:name="HTML Variable" w:semiHidden="1" w:unhideWhenUsed="1"/>
-    <w:lsdException w:name="Normal Table" w:semiHidden="1" w:unhideWhenUsed="1"/>
-    <w:lsdException w:name="annotation subject" w:semiHidden="1" w:unhideWhenUsed="1"/>
-    <w:lsdException w:name="No List" w:semiHidden="1" w:unhideWhenUsed="1"/>
-    <w:lsdException w:name="Outline List 1" w:semiHidden="1" w:unhideWhenUsed="1"/>
-    <w:lsdException w:name="Outline List 2" w:semiHidden="1" w:unhideWhenUsed="1"/>
-    <w:lsdException w:name="Outline List 3" w:semiHidden="1" w:unhideWhenUsed="1"/>
-    <w:lsdException w:name="Table Simple 1" w:semiHidden="1" w:unhideWhenUsed="1"/>
-    <w:lsdException w:name="Table Simple 2" w:semiHidden="1" w:unhideWhenUsed="1"/>
-    <w:lsdException w:name="Table Simple 3" w:semiHidden="1" w:unhideWhenUsed="1"/>
-    <w:lsdException w:name="Table Classic 1" w:semiHidden="1" w:unhideWhenUsed="1"/>
-    <w:lsdException w:name="Table Classic 2" w:semiHidden="1" w:unhideWhenUsed="1"/>
-    <w:lsdException w:name="Table Classic 3" w:semiHidden="1" w:unhideWhenUsed="1"/>
-    <w:lsdException w:name="Table Classic 4" w:semiHidden="1" w:unhideWhenUsed="1"/>
-    <w:lsdException w:name="Table Colorful 1" w:semiHidden="1" w:unhideWhenUsed="1"/>
-    <w:lsdException w:name="Table Colorful 2" w:semiHidden="1" w:unhideWhenUsed="1"/>
-    <w:lsdException w:name="Table Colorful 3" w:semiHidden="1" w:unhideWhenUsed="1"/>
-    <w:lsdException w:name="Table Columns 1" w:semiHidden="1" w:unhideWhenUsed="1"/>
-    <w:lsdException w:name="Table Columns 2" w:semiHidden="1" w:unhideWhenUsed="1"/>
-    <w:lsdException w:name="Table Columns 3" w:semiHidden="1" w:unhideWhenUsed="1"/>
-    <w:lsdException w:name="Table Columns 4" w:semiHidden="1" w:unhideWhenUsed="1"/>
-    <w:lsdException w:name="Table Columns 5" w:semiHidden="1" w:unhideWhenUsed="1"/>
-    <w:lsdException w:name="Table Grid 1" w:semiHidden="1" w:unhideWhenUsed="1"/>
-    <w:lsdException w:name="Table Grid 2" w:semiHidden="1" w:unhideWhenUsed="1"/>
-    <w:lsdException w:name="Table Grid 3" w:semiHidden="1" w:unhideWhenUsed="1"/>
-    <w:lsdException w:name="Table Grid 4" w:semiHidden="1" w:unhideWhenUsed="1"/>
-    <w:lsdException w:name="Table Grid 5" w:semiHidden="1" w:unhideWhenUsed="1"/>
-    <w:lsdException w:name="Table Grid 6" w:semiHidden="1" w:unhideWhenUsed="1"/>
-    <w:lsdException w:name="Table Grid 7" w:semiHidden="1" w:unhideWhenUsed="1"/>
-    <w:lsdException w:name="Table Grid 8" w:semiHidden="1" w:unhideWhenUsed="1"/>
-    <w:lsdException w:name="Table List 1" w:semiHidden="1" w:unhideWhenUsed="1"/>
-    <w:lsdException w:name="Table List 2" w:semiHidden="1" w:unhideWhenUsed="1"/>
-    <w:lsdException w:name="Table List 3" w:semiHidden="1" w:unhideWhenUsed="1"/>
-    <w:lsdException w:name="Table List 4" w:semiHidden="1" w:unhideWhenUsed="1"/>
-    <w:lsdException w:name="Table List 5" w:semiHidden="1" w:unhideWhenUsed="1"/>
-    <w:lsdException w:name="Table List 6" w:semiHidden="1" w:unhideWhenUsed="1"/>
-    <w:lsdException w:name="Table List 7" w:semiHidden="1" w:unhideWhenUsed="1"/>
-    <w:lsdException w:name="Table List 8" w:semiHidden="1" w:unhideWhenUsed="1"/>
-    <w:lsdException w:name="Table 3D effects 1" w:semiHidden="1" w:unhideWhenUsed="1"/>
-    <w:lsdException w:name="Table 3D effects 2" w:semiHidden="1" w:unhideWhenUsed="1"/>
-    <w:lsdException w:name="Table 3D effects 3" w:semiHidden="1" w:unhideWhenUsed="1"/>
-    <w:lsdException w:name="Table Contemporary" w:semiHidden="1" w:unhideWhenUsed="1"/>
-    <w:lsdException w:name="Table Elegant" w:semiHidden="1" w:unhideWhenUsed="1"/>
-    <w:lsdException w:name="Table Professional" w:semiHidden="1" w:unhideWhenUsed="1"/>
-    <w:lsdException w:name="Table Subtle 1" w:semiHidden="1" w:unhideWhenUsed="1"/>
-    <w:lsdException w:name="Table Subtle 2" w:semiHidden="1" w:unhideWhenUsed="1"/>
-    <w:lsdException w:name="Table Web 1" w:semiHidden="1" w:unhideWhenUsed="1"/>
-    <w:lsdException w:name="Table Web 2" w:semiHidden="1" w:unhideWhenUsed="1"/>
-    <w:lsdException w:name="Table Web 3" w:semiHidden="1" w:unhideWhenUsed="1"/>
-    <w:lsdException w:name="Balloon Text" w:semiHidden="1" w:unhideWhenUsed="1"/>
-    <w:lsdException w:name="Table Grid" w:uiPriority="39"/>
-    <w:lsdException w:name="Table Theme" w:semiHidden="1" w:unhideWhenUsed="1"/>
-    <w:lsdException w:name="Placeholder Text" w:semiHidden="1"/>
-    <w:lsdException w:name="No Spacing" w:uiPriority="1" w:qFormat="1"/>
-    <w:lsdException w:name="Light Shading" w:uiPriority="60"/>
-    <w:lsdException w:name="Light List" w:uiPriority="61"/>
-    <w:lsdException w:name="Light Grid" w:uiPriority="62"/>
-    <w:lsdException w:name="Medium Shading 1" w:uiPriority="63"/>
-    <w:lsdException w:name="Medium Shading 2" w:uiPriority="64"/>
-    <w:lsdException w:name="Medium List 1" w:uiPriority="65"/>
-    <w:lsdException w:name="Medium List 2" w:uiPriority="66"/>
-    <w:lsdException w:name="Medium Grid 1" w:uiPriority="67"/>
-    <w:lsdException w:name="Medium Grid 2" w:uiPriority="68"/>
-    <w:lsdException w:name="Medium Grid 3" w:uiPriority="69"/>
-    <w:lsdException w:name="Dark List" w:uiPriority="70"/>
-    <w:lsdException w:name="Colorful Shading" w:uiPriority="71"/>
-    <w:lsdException w:name="Colorful List" w:uiPriority="72"/>
-    <w:lsdException w:name="Colorful Grid" w:uiPriority="73"/>
-    <w:lsdException w:name="Light Shading Accent 1" w:uiPriority="60"/>
-    <w:lsdException w:name="Light List Accent 1" w:uiPriority="61"/>
-    <w:lsdException w:name="Light Grid Accent 1" w:uiPriority="62"/>
-    <w:lsdException w:name="Medium Shading 1 Accent 1" w:uiPriority="63"/>
-    <w:lsdException w:name="Medium Shading 2 Accent 1" w:uiPriority="64"/>
-    <w:lsdException w:name="Medium List 1 Accent 1" w:uiPriority="65"/>
-    <w:lsdException w:name="Revision" w:semiHidden="1"/>
-    <w:lsdException w:name="List Paragraph" w:uiPriority="34" w:qFormat="1"/>
-    <w:lsdException w:name="Quote" w:uiPriority="29" w:qFormat="1"/>
-    <w:lsdException w:name="Intense Quote" w:uiPriority="30" w:qFormat="1"/>
-    <w:lsdException w:name="Medium List 2 Accent 1" w:uiPriority="66"/>
-    <w:lsdException w:name="Medium Grid 1 Accent 1" w:uiPriority="67"/>
-    <w:lsdException w:name="Medium Grid 2 Accent 1" w:uiPriority="68"/>
-    <w:lsdException w:name="Medium Grid 3 Accent 1" w:uiPriority="69"/>
-    <w:lsdException w:name="Dark List Accent 1" w:uiPriority="70"/>
-    <w:lsdException w:name="Colorful Shading Accent 1" w:uiPriority="71"/>
-    <w:lsdException w:name="Colorful List Accent 1" w:uiPriority="72"/>
-    <w:lsdException w:name="Colorful Grid Accent 1" w:uiPriority="73"/>
-    <w:lsdException w:name="Light Shading Accent 2" w:uiPriority="60"/>
-    <w:lsdException w:name="Light List Accent 2" w:uiPriority="61"/>
-    <w:lsdException w:name="Light Grid Accent 2" w:uiPriority="62"/>
-    <w:lsdException w:name="Medium Shading 1 Accent 2" w:uiPriority="63"/>
-    <w:lsdException w:name="Medium Shading 2 Accent 2" w:uiPriority="64"/>
-    <w:lsdException w:name="Medium List 1 Accent 2" w:uiPriority="65"/>
-    <w:lsdException w:name="Medium List 2 Accent 2" w:uiPriority="66"/>
-    <w:lsdException w:name="Medium Grid 1 Accent 2" w:uiPriority="67"/>
-    <w:lsdException w:name="Medium Grid 2 Accent 2" w:uiPriority="68"/>
-    <w:lsdException w:name="Medium Grid 3 Accent 2" w:uiPriority="69"/>
-    <w:lsdException w:name="Dark List Accent 2" w:uiPriority="70"/>
-    <w:lsdException w:name="Colorful Shading Accent 2" w:uiPriority="71"/>
-    <w:lsdException w:name="Colorful List Accent 2" w:uiPriority="72"/>
-    <w:lsdException w:name="Colorful Grid Accent 2" w:uiPriority="73"/>
-    <w:lsdException w:name="Light Shading Accent 3" w:uiPriority="60"/>
-    <w:lsdException w:name="Light List Accent 3" w:uiPriority="61"/>
-    <w:lsdException w:name="Light Grid Accent 3" w:uiPriority="62"/>
-    <w:lsdException w:name="Medium Shading 1 Accent 3" w:uiPriority="63"/>
-    <w:lsdException w:name="Medium Shading 2 Accent 3" w:uiPriority="64"/>
-    <w:lsdException w:name="Medium List 1 Accent 3" w:uiPriority="65"/>
-    <w:lsdException w:name="Medium List 2 Accent 3" w:uiPriority="66"/>
-    <w:lsdException w:name="Medium Grid 1 Accent 3" w:uiPriority="67"/>
-    <w:lsdException w:name="Medium Grid 2 Accent 3" w:uiPriority="68"/>
-    <w:lsdException w:name="Medium Grid 3 Accent 3" w:uiPriority="69"/>
-    <w:lsdException w:name="Dark List Accent 3" w:uiPriority="70"/>
-    <w:lsdException w:name="Colorful Shading Accent 3" w:uiPriority="71"/>
-    <w:lsdException w:name="Colorful List Accent 3" w:uiPriority="72"/>
-    <w:lsdException w:name="Colorful Grid Accent 3" w:uiPriority="73"/>
-    <w:lsdException w:name="Light Shading Accent 4" w:uiPriority="60"/>
-    <w:lsdException w:name="Light List Accent 4" w:uiPriority="61"/>
-    <w:lsdException w:name="Light Grid Accent 4" w:uiPriority="62"/>
-    <w:lsdException w:name="Medium Shading 1 Accent 4" w:uiPriority="63"/>
-    <w:lsdException w:name="Medium Shading 2 Accent 4" w:uiPriority="64"/>
-    <w:lsdException w:name="Medium List 1 Accent 4" w:uiPriority="65"/>
-    <w:lsdException w:name="Medium List 2 Accent 4" w:uiPriority="66"/>
-    <w:lsdException w:name="Medium Grid 1 Accent 4" w:uiPriority="67"/>
-    <w:lsdException w:name="Medium Grid 2 Accent 4" w:uiPriority="68"/>
-    <w:lsdException w:name="Medium Grid 3 Accent 4" w:uiPriority="69"/>
-    <w:lsdException w:name="Dark List Accent 4" w:uiPriority="70"/>
-    <w:lsdException w:name="Colorful Shading Accent 4" w:uiPriority="71"/>
-    <w:lsdException w:name="Colorful List Accent 4" w:uiPriority="72"/>
-    <w:lsdException w:name="Colorful Grid Accent 4" w:uiPriority="73"/>
-    <w:lsdException w:name="Light Shading Accent 5" w:uiPriority="60"/>
-    <w:lsdException w:name="Light List Accent 5" w:uiPriority="61"/>
-    <w:lsdException w:name="Light Grid Accent 5" w:uiPriority="62"/>
-    <w:lsdException w:name="Medium Shading 1 Accent 5" w:uiPriority="63"/>
-    <w:lsdException w:name="Medium Shading 2 Accent 5" w:uiPriority="64"/>
-    <w:lsdException w:name="Medium List 1 Accent 5" w:uiPriority="65"/>
-    <w:lsdException w:name="Medium List 2 Accent 5" w:uiPriority="66"/>
-    <w:lsdException w:name="Medium Grid 1 Accent 5" w:uiPriority="67"/>
-    <w:lsdException w:name="Medium Grid 2 Accent 5" w:uiPriority="68"/>
-    <w:lsdException w:name="Medium Grid 3 Accent 5" w:uiPriority="69"/>
-    <w:lsdException w:name="Dark List Accent 5" w:uiPriority="70"/>
-    <w:lsdException w:name="Colorful Shading Accent 5" w:uiPriority="71"/>
-    <w:lsdException w:name="Colorful List Accent 5" w:uiPriority="72"/>
-    <w:lsdException w:name="Colorful Grid Accent 5" w:uiPriority="73"/>
-    <w:lsdException w:name="Light Shading Accent 6" w:uiPriority="60"/>
-    <w:lsdException w:name="Light List Accent 6" w:uiPriority="61"/>
-    <w:lsdException w:name="Light Grid Accent 6" w:uiPriority="62"/>
-    <w:lsdException w:name="Medium Shading 1 Accent 6" w:uiPriority="63"/>
-    <w:lsdException w:name="Medium Shading 2 Accent 6" w:uiPriority="64"/>
-    <w:lsdException w:name="Medium List 1 Accent 6" w:uiPriority="65"/>
-    <w:lsdException w:name="Medium List 2 Accent 6" w:uiPriority="66"/>
-    <w:lsdException w:name="Medium Grid 1 Accent 6" w:uiPriority="67"/>
-    <w:lsdException w:name="Medium Grid 2 Accent 6" w:uiPriority="68"/>
-    <w:lsdException w:name="Medium Grid 3 Accent 6" w:uiPriority="69"/>
-    <w:lsdException w:name="Dark List Accent 6" w:uiPriority="70"/>
-    <w:lsdException w:name="Colorful Shading Accent 6" w:uiPriority="71"/>
-    <w:lsdException w:name="Colorful List Accent 6" w:uiPriority="72"/>
-    <w:lsdException w:name="Colorful Grid Accent 6" w:uiPriority="73"/>
-    <w:lsdException w:name="Subtle Emphasis" w:uiPriority="19" w:qFormat="1"/>
-    <w:lsdException w:name="Intense Emphasis" w:uiPriority="21" w:qFormat="1"/>
-    <w:lsdException w:name="Subtle Reference" w:uiPriority="31" w:qFormat="1"/>
-    <w:lsdException w:name="Intense Reference" w:uiPriority="32" w:qFormat="1"/>
-    <w:lsdException w:name="Book Title" w:uiPriority="33" w:qFormat="1"/>
-    <w:lsdException w:name="Bibliography" w:semiHidden="1" w:uiPriority="37" w:unhideWhenUsed="1"/>
-    <w:lsdException w:name="TOC Heading" w:semiHidden="1" w:uiPriority="39" w:unhideWhenUsed="1" w:qFormat="1"/>
-    <w:lsdException w:name="Plain Table 1" w:uiPriority="41"/>
-    <w:lsdException w:name="Plain Table 2" w:uiPriority="42"/>
-    <w:lsdException w:name="Plain Table 3" w:uiPriority="43"/>
-    <w:lsdException w:name="Plain Table 4" w:uiPriority="44"/>
-    <w:lsdException w:name="Plain Table 5" w:uiPriority="45"/>
-    <w:lsdException w:name="Grid Table Light" w:uiPriority="40"/>
-    <w:lsdException w:name="Grid Table 1 Light" w:uiPriority="46"/>
-    <w:lsdException w:name="Grid Table 2" w:uiPriority="47"/>
-    <w:lsdException w:name="Grid Table 3" w:uiPriority="48"/>
-    <w:lsdException w:name="Grid Table 4" w:uiPriority="49"/>
-    <w:lsdException w:name="Grid Table 5 Dark" w:uiPriority="50"/>
-    <w:lsdException w:name="Grid Table 6 Colorful" w:uiPriority="51"/>
-    <w:lsdException w:name="Grid Table 7 Colorful" w:uiPriority="52"/>
-    <w:lsdException w:name="Grid Table 1 Light Accent 1" w:uiPriority="46"/>
-    <w:lsdException w:name="Grid Table 2 Accent 1" w:uiPriority="47"/>
-    <w:lsdException w:name="Grid Table 3 Accent 1" w:uiPriority="48"/>
-    <w:lsdException w:name="Grid Table 4 Accent 1" w:uiPriority="49"/>
-    <w:lsdException w:name="Grid Table 5 Dark Accent 1" w:uiPriority="50"/>
-    <w:lsdException w:name="Grid Table 6 Colorful Accent 1" w:uiPriority="51"/>
-    <w:lsdException w:name="Grid Table 7 Colorful Accent 1" w:uiPriority="52"/>
-    <w:lsdException w:name="Grid Table 1 Light Accent 2" w:uiPriority="46"/>
-    <w:lsdException w:name="Grid Table 2 Accent 2" w:uiPriority="47"/>
-    <w:lsdException w:name="Grid Table 3 Accent 2" w:uiPriority="48"/>
-    <w:lsdException w:name="Grid Table 4 Accent 2" w:uiPriority="49"/>
-    <w:lsdException w:name="Grid Table 5 Dark Accent 2" w:uiPriority="50"/>
-    <w:lsdException w:name="Grid Table 6 Colorful Accent 2" w:uiPriority="51"/>
-    <w:lsdException w:name="Grid Table 7 Colorful Accent 2" w:uiPriority="52"/>
-    <w:lsdException w:name="Grid Table 1 Light Accent 3" w:uiPriority="46"/>
-    <w:lsdException w:name="Grid Table 2 Accent 3" w:uiPriority="47"/>
-    <w:lsdException w:name="Grid Table 3 Accent 3" w:uiPriority="48"/>
-    <w:lsdException w:name="Grid Table 4 Accent 3" w:uiPriority="49"/>
-    <w:lsdException w:name="Grid Table 5 Dark Accent 3" w:uiPriority="50"/>
-    <w:lsdException w:name="Grid Table 6 Colorful Accent 3" w:uiPriority="51"/>
-    <w:lsdException w:name="Grid Table 7 Colorful Accent 3" w:uiPriority="52"/>
-    <w:lsdException w:name="Grid Table 1 Light Accent 4" w:uiPriority="46"/>
-    <w:lsdException w:name="Grid Table 2 Accent 4" w:uiPriority="47"/>
-    <w:lsdException w:name="Grid Table 3 Accent 4" w:uiPriority="48"/>
-    <w:lsdException w:name="Grid Table 4 Accent 4" w:uiPriority="49"/>
-    <w:lsdException w:name="Grid Table 5 Dark Accent 4" w:uiPriority="50"/>
-    <w:lsdException w:name="Grid Table 6 Colorful Accent 4" w:uiPriority="51"/>
-    <w:lsdException w:name="Grid Table 7 Colorful Accent 4" w:uiPriority="52"/>
-    <w:lsdException w:name="Grid Table 1 Light Accent 5" w:uiPriority="46"/>
-    <w:lsdException w:name="Grid Table 2 Accent 5" w:uiPriority="47"/>
-    <w:lsdException w:name="Grid Table 3 Accent 5" w:uiPriority="48"/>
-    <w:lsdException w:name="Grid Table 4 Accent 5" w:uiPriority="49"/>
-    <w:lsdException w:name="Grid Table 5 Dark Accent 5" w:uiPriority="50"/>
-    <w:lsdException w:name="Grid Table 6 Colorful Accent 5" w:uiPriority="51"/>
-    <w:lsdException w:name="Grid Table 7 Colorful Accent 5" w:uiPriority="52"/>
-    <w:lsdException w:name="Grid Table 1 Light Accent 6" w:uiPriority="46"/>
-    <w:lsdException w:name="Grid Table 2 Accent 6" w:uiPriority="47"/>
-    <w:lsdException w:name="Grid Table 3 Accent 6" w:uiPriority="48"/>
-    <w:lsdException w:name="Grid Table 4 Accent 6" w:uiPriority="49"/>
-    <w:lsdException w:name="Grid Table 5 Dark Accent 6" w:uiPriority="50"/>
-    <w:lsdException w:name="Grid Table 6 Colorful Accent 6" w:uiPriority="51"/>
-    <w:lsdException w:name="Grid Table 7 Colorful Accent 6" w:uiPriority="52"/>
-    <w:lsdException w:name="List Table 1 Light" w:uiPriority="46"/>
-    <w:lsdException w:name="List Table 2" w:uiPriority="47"/>
-    <w:lsdException w:name="List Table 3" w:uiPriority="48"/>
-    <w:lsdException w:name="List Table 4" w:uiPriority="49"/>
-    <w:lsdException w:name="List Table 5 Dark" w:uiPriority="50"/>
-    <w:lsdException w:name="List Table 6 Colorful" w:uiPriority="51"/>
-    <w:lsdException w:name="List Table 7 Colorful" w:uiPriority="52"/>
-    <w:lsdException w:name="List Table 1 Light Accent 1" w:uiPriority="46"/>
-    <w:lsdException w:name="List Table 2 Accent 1" w:uiPriority="47"/>
-    <w:lsdException w:name="List Table 3 Accent 1" w:uiPriority="48"/>
-    <w:lsdException w:name="List Table 4 Accent 1" w:uiPriority="49"/>
-    <w:lsdException w:name="List Table 5 Dark Accent 1" w:uiPriority="50"/>
-    <w:lsdException w:name="List Table 6 Colorful Accent 1" w:uiPriority="51"/>
-    <w:lsdException w:name="List Table 7 Colorful Accent 1" w:uiPriority="52"/>
-    <w:lsdException w:name="List Table 1 Light Accent 2" w:uiPriority="46"/>
-    <w:lsdException w:name="List Table 2 Accent 2" w:uiPriority="47"/>
-    <w:lsdException w:name="List Table 3 Accent 2" w:uiPriority="48"/>
-    <w:lsdException w:name="List Table 4 Accent 2" w:uiPriority="49"/>
-    <w:lsdException w:name="List Table 5 Dark Accent 2" w:uiPriority="50"/>
-    <w:lsdException w:name="List Table 6 Colorful Accent 2" w:uiPriority="51"/>
-    <w:lsdException w:name="List Table 7 Colorful Accent 2" w:uiPriority="52"/>
-    <w:lsdException w:name="List Table 1 Light Accent 3" w:uiPriority="46"/>
-    <w:lsdException w:name="List Table 2 Accent 3" w:uiPriority="47"/>
-    <w:lsdException w:name="List Table 3 Accent 3" w:uiPriority="48"/>
-    <w:lsdException w:name="List Table 4 Accent 3" w:uiPriority="49"/>
-    <w:lsdException w:name="List Table 5 Dark Accent 3" w:uiPriority="50"/>
-    <w:lsdException w:name="List Table 6 Colorful Accent 3" w:uiPriority="51"/>
-    <w:lsdException w:name="List Table 7 Colorful Accent 3" w:uiPriority="52"/>
-    <w:lsdException w:name="List Table 1 Light Accent 4" w:uiPriority="46"/>
-    <w:lsdException w:name="List Table 2 Accent 4" w:uiPriority="47"/>
-    <w:lsdException w:name="List Table 3 Accent 4" w:uiPriority="48"/>
-    <w:lsdException w:name="List Table 4 Accent 4" w:uiPriority="49"/>
-    <w:lsdException w:name="List Table 5 Dark Accent 4" w:uiPriority="50"/>
-    <w:lsdException w:name="List Table 6 Colorful Accent 4" w:uiPriority="51"/>
-    <w:lsdException w:name="List Table 7 Colorful Accent 4" w:uiPriority="52"/>
-    <w:lsdException w:name="List Table 1 Light Accent 5" w:uiPriority="46"/>
-    <w:lsdException w:name="List Table 2 Accent 5" w:uiPriority="47"/>
-    <w:lsdException w:name="List Table 3 Accent 5" w:uiPriority="48"/>
-    <w:lsdException w:name="List Table 4 Accent 5" w:uiPriority="49"/>
-    <w:lsdException w:name="List Table 5 Dark Accent 5" w:uiPriority="50"/>
-    <w:lsdException w:name="List Table 6 Colorful Accent 5" w:uiPriority="51"/>
-    <w:lsdException w:name="List Table 7 Colorful Accent 5" w:uiPriority="52"/>
-    <w:lsdException w:name="List Table 1 Light Accent 6" w:uiPriority="46"/>
-    <w:lsdException w:name="List Table 2 Accent 6" w:uiPriority="47"/>
-    <w:lsdException w:name="List Table 3 Accent 6" w:uiPriority="48"/>
-    <w:lsdException w:name="List Table 4 Accent 6" w:uiPriority="49"/>
-    <w:lsdException w:name="List Table 5 Dark Accent 6" w:uiPriority="50"/>
-    <w:lsdException w:name="List Table 6 Colorful Accent 6" w:uiPriority="51"/>
-    <w:lsdException w:name="List Table 7 Colorful Accent 6" w:uiPriority="52"/>
-    <w:lsdException w:name="Mention" w:semiHidden="1" w:unhideWhenUsed="1"/>
-    <w:lsdException w:name="Smart Hyperlink" w:semiHidden="1" w:unhideWhenUsed="1"/>
-    <w:lsdException w:name="Hashtag" w:semiHidden="1" w:unhideWhenUsed="1"/>
-    <w:lsdException w:name="Unresolved Mention" w:semiHidden="1" w:unhideWhenUsed="1"/>
-    <w:lsdException w:name="Smart Link" w:semiHidden="1" w:unhideWhenUsed="1"/>
+  <w:latentStyles w:defLockedState="0" w:defUIPriority="99" w:defSemiHidden="1" w:defUnhideWhenUsed="1" w:defQFormat="0" w:count="267">
+    <w:lsdException w:name="Normal" w:semiHidden="0" w:uiPriority="0" w:unhideWhenUsed="0" w:qFormat="1"/>
+    <w:lsdException w:name="heading 1" w:semiHidden="0" w:uiPriority="9" w:unhideWhenUsed="0" w:qFormat="1"/>
+    <w:lsdException w:name="heading 2" w:uiPriority="9" w:qFormat="1"/>
+    <w:lsdException w:name="heading 3" w:uiPriority="9" w:qFormat="1"/>
+    <w:lsdException w:name="heading 4" w:uiPriority="9" w:qFormat="1"/>
+    <w:lsdException w:name="heading 5" w:uiPriority="9" w:qFormat="1"/>
+    <w:lsdException w:name="heading 6" w:uiPriority="9" w:qFormat="1"/>
+    <w:lsdException w:name="heading 7" w:uiPriority="9" w:qFormat="1"/>
+    <w:lsdException w:name="heading 8" w:uiPriority="9" w:qFormat="1"/>
+    <w:lsdException w:name="heading 9" w:uiPriority="9" w:qFormat="1"/>
+    <w:lsdException w:name="toc 1" w:uiPriority="39"/>
+    <w:lsdException w:name="toc 2" w:uiPriority="39"/>
+    <w:lsdException w:name="toc 3" w:uiPriority="39"/>
+    <w:lsdException w:name="toc 4" w:uiPriority="39"/>
+    <w:lsdException w:name="toc 5" w:uiPriority="39"/>
+    <w:lsdException w:name="toc 6" w:uiPriority="39"/>
+    <w:lsdException w:name="toc 7" w:uiPriority="39"/>
+    <w:lsdException w:name="toc 8" w:uiPriority="39"/>
+    <w:lsdException w:name="toc 9" w:uiPriority="39"/>
+    <w:lsdException w:name="caption" w:uiPriority="35" w:qFormat="1"/>
+    <w:lsdException w:name="Title" w:semiHidden="0" w:uiPriority="10" w:unhideWhenUsed="0" w:qFormat="1"/>
+    <w:lsdException w:name="Default Paragraph Font" w:uiPriority="1"/>
+    <w:lsdException w:name="Subtitle" w:semiHidden="0" w:uiPriority="11" w:unhideWhenUsed="0" w:qFormat="1"/>
+    <w:lsdException w:name="Strong" w:semiHidden="0" w:uiPriority="22" w:unhideWhenUsed="0" w:qFormat="1"/>
+    <w:lsdException w:name="Emphasis" w:semiHidden="0" w:uiPriority="20" w:unhideWhenUsed="0" w:qFormat="1"/>
+    <w:lsdException w:name="Table Grid" w:semiHidden="0" w:uiPriority="39" w:unhideWhenUsed="0"/>
+    <w:lsdException w:name="Placeholder Text" w:unhideWhenUsed="0"/>
+    <w:lsdException w:name="No Spacing" w:semiHidden="0" w:uiPriority="1" w:unhideWhenUsed="0" w:qFormat="1"/>
+    <w:lsdException w:name="Light Shading" w:semiHidden="0" w:uiPriority="60" w:unhideWhenUsed="0"/>
+    <w:lsdException w:name="Light List" w:semiHidden="0" w:uiPriority="61" w:unhideWhenUsed="0"/>
+    <w:lsdException w:name="Light Grid" w:semiHidden="0" w:uiPriority="62" w:unhideWhenUsed="0"/>
+    <w:lsdException w:name="Medium Shading 1" w:semiHidden="0" w:uiPriority="63" w:unhideWhenUsed="0"/>
+    <w:lsdException w:name="Medium Shading 2" w:semiHidden="0" w:uiPriority="64" w:unhideWhenUsed="0"/>
+    <w:lsdException w:name="Medium List 1" w:semiHidden="0" w:uiPriority="65" w:unhideWhenUsed="0"/>
+    <w:lsdException w:name="Medium List 2" w:semiHidden="0" w:uiPriority="66" w:unhideWhenUsed="0"/>
+    <w:lsdException w:name="Medium Grid 1" w:semiHidden="0" w:uiPriority="67" w:unhideWhenUsed="0"/>
+    <w:lsdException w:name="Medium Grid 2" w:semiHidden="0" w:uiPriority="68" w:unhideWhenUsed="0"/>
+    <w:lsdException w:name="Medium Grid 3" w:semiHidden="0" w:uiPriority="69" w:unhideWhenUsed="0"/>
+    <w:lsdException w:name="Dark List" w:semiHidden="0" w:uiPriority="70" w:unhideWhenUsed="0"/>
+    <w:lsdException w:name="Colorful Shading" w:semiHidden="0" w:uiPriority="71" w:unhideWhenUsed="0"/>
+    <w:lsdException w:name="Colorful List" w:semiHidden="0" w:uiPriority="72" w:unhideWhenUsed="0"/>
+    <w:lsdException w:name="Colorful Grid" w:semiHidden="0" w:uiPriority="73" w:unhideWhenUsed="0"/>
+    <w:lsdException w:name="Light Shading Accent 1" w:semiHidden="0" w:uiPriority="60" w:unhideWhenUsed="0"/>
+    <w:lsdException w:name="Light List Accent 1" w:semiHidden="0" w:uiPriority="61" w:unhideWhenUsed="0"/>
+    <w:lsdException w:name="Light Grid Accent 1" w:semiHidden="0" w:uiPriority="62" w:unhideWhenUsed="0"/>
+    <w:lsdException w:name="Medium Shading 1 Accent 1" w:semiHidden="0" w:uiPriority="63" w:unhideWhenUsed="0"/>
+    <w:lsdException w:name="Medium Shading 2 Accent 1" w:semiHidden="0" w:uiPriority="64" w:unhideWhenUsed="0"/>
+    <w:lsdException w:name="Medium List 1 Accent 1" w:semiHidden="0" w:uiPriority="65" w:unhideWhenUsed="0"/>
+    <w:lsdException w:name="Revision" w:unhideWhenUsed="0"/>
+    <w:lsdException w:name="List Paragraph" w:semiHidden="0" w:uiPriority="34" w:unhideWhenUsed="0" w:qFormat="1"/>
+    <w:lsdException w:name="Quote" w:semiHidden="0" w:uiPriority="29" w:unhideWhenUsed="0" w:qFormat="1"/>
+    <w:lsdException w:name="Intense Quote" w:semiHidden="0" w:uiPriority="30" w:unhideWhenUsed="0" w:qFormat="1"/>
+    <w:lsdException w:name="Medium List 2 Accent 1" w:semiHidden="0" w:uiPriority="66" w:unhideWhenUsed="0"/>
+    <w:lsdException w:name="Medium Grid 1 Accent 1" w:semiHidden="0" w:uiPriority="67" w:unhideWhenUsed="0"/>
+    <w:lsdException w:name="Medium Grid 2 Accent 1" w:semiHidden="0" w:uiPriority="68" w:unhideWhenUsed="0"/>
+    <w:lsdException w:name="Medium Grid 3 Accent 1" w:semiHidden="0" w:uiPriority="69" w:unhideWhenUsed="0"/>
+    <w:lsdException w:name="Dark List Accent 1" w:semiHidden="0" w:uiPriority="70" w:unhideWhenUsed="0"/>
+    <w:lsdException w:name="Colorful Shading Accent 1" w:semiHidden="0" w:uiPriority="71" w:unhideWhenUsed="0"/>
+    <w:lsdException w:name="Colorful List Accent 1" w:semiHidden="0" w:uiPriority="72" w:unhideWhenUsed="0"/>
+    <w:lsdException w:name="Colorful Grid Accent 1" w:semiHidden="0" w:uiPriority="73" w:unhideWhenUsed="0"/>
+    <w:lsdException w:name="Light Shading Accent 2" w:semiHidden="0" w:uiPriority="60" w:unhideWhenUsed="0"/>
+    <w:lsdException w:name="Light List Accent 2" w:semiHidden="0" w:uiPriority="61" w:unhideWhenUsed="0"/>
+    <w:lsdException w:name="Light Grid Accent 2" w:semiHidden="0" w:uiPriority="62" w:unhideWhenUsed="0"/>
+    <w:lsdException w:name="Medium Shading 1 Accent 2" w:semiHidden="0" w:uiPriority="63" w:unhideWhenUsed="0"/>
+    <w:lsdException w:name="Medium Shading 2 Accent 2" w:semiHidden="0" w:uiPriority="64" w:unhideWhenUsed="0"/>
+    <w:lsdException w:name="Medium List 1 Accent 2" w:semiHidden="0" w:uiPriority="65" w:unhideWhenUsed="0"/>
+    <w:lsdException w:name="Medium List 2 Accent 2" w:semiHidden="0" w:uiPriority="66" w:unhideWhenUsed="0"/>
+    <w:lsdException w:name="Medium Grid 1 Accent 2" w:semiHidden="0" w:uiPriority="67" w:unhideWhenUsed="0"/>
+    <w:lsdException w:name="Medium Grid 2 Accent 2" w:semiHidden="0" w:uiPriority="68" w:unhideWhenUsed="0"/>
+    <w:lsdException w:name="Medium Grid 3 Accent 2" w:semiHidden="0" w:uiPriority="69" w:unhideWhenUsed="0"/>
+    <w:lsdException w:name="Dark List Accent 2" w:semiHidden="0" w:uiPriority="70" w:unhideWhenUsed="0"/>
+    <w:lsdException w:name="Colorful Shading Accent 2" w:semiHidden="0" w:uiPriority="71" w:unhideWhenUsed="0"/>
+    <w:lsdException w:name="Colorful List Accent 2" w:semiHidden="0" w:uiPriority="72" w:unhideWhenUsed="0"/>
+    <w:lsdException w:name="Colorful Grid Accent 2" w:semiHidden="0" w:uiPriority="73" w:unhideWhenUsed="0"/>
+    <w:lsdException w:name="Light Shading Accent 3" w:semiHidden="0" w:uiPriority="60" w:unhideWhenUsed="0"/>
+    <w:lsdException w:name="Light List Accent 3" w:semiHidden="0" w:uiPriority="61" w:unhideWhenUsed="0"/>
+    <w:lsdException w:name="Light Grid Accent 3" w:semiHidden="0" w:uiPriority="62" w:unhideWhenUsed="0"/>
+    <w:lsdException w:name="Medium Shading 1 Accent 3" w:semiHidden="0" w:uiPriority="63" w:unhideWhenUsed="0"/>
+    <w:lsdException w:name="Medium Shading 2 Accent 3" w:semiHidden="0" w:uiPriority="64" w:unhideWhenUsed="0"/>
+    <w:lsdException w:name="Medium List 1 Accent 3" w:semiHidden="0" w:uiPriority="65" w:unhideWhenUsed="0"/>
+    <w:lsdException w:name="Medium List 2 Accent 3" w:semiHidden="0" w:uiPriority="66" w:unhideWhenUsed="0"/>
+    <w:lsdException w:name="Medium Grid 1 Accent 3" w:semiHidden="0" w:uiPriority="67" w:unhideWhenUsed="0"/>
+    <w:lsdException w:name="Medium Grid 2 Accent 3" w:semiHidden="0" w:uiPriority="68" w:unhideWhenUsed="0"/>
+    <w:lsdException w:name="Medium Grid 3 Accent 3" w:semiHidden="0" w:uiPriority="69" w:unhideWhenUsed="0"/>
+    <w:lsdException w:name="Dark List Accent 3" w:semiHidden="0" w:uiPriority="70" w:unhideWhenUsed="0"/>
+    <w:lsdException w:name="Colorful Shading Accent 3" w:semiHidden="0" w:uiPriority="71" w:unhideWhenUsed="0"/>
+    <w:lsdException w:name="Colorful List Accent 3" w:semiHidden="0" w:uiPriority="72" w:unhideWhenUsed="0"/>
+    <w:lsdException w:name="Colorful Grid Accent 3" w:semiHidden="0" w:uiPriority="73" w:unhideWhenUsed="0"/>
+    <w:lsdException w:name="Light Shading Accent 4" w:semiHidden="0" w:uiPriority="60" w:unhideWhenUsed="0"/>
+    <w:lsdException w:name="Light List Accent 4" w:semiHidden="0" w:uiPriority="61" w:unhideWhenUsed="0"/>
+    <w:lsdException w:name="Light Grid Accent 4" w:semiHidden="0" w:uiPriority="62" w:unhideWhenUsed="0"/>
+    <w:lsdException w:name="Medium Shading 1 Accent 4" w:semiHidden="0" w:uiPriority="63" w:unhideWhenUsed="0"/>
+    <w:lsdException w:name="Medium Shading 2 Accent 4" w:semiHidden="0" w:uiPriority="64" w:unhideWhenUsed="0"/>
+    <w:lsdException w:name="Medium List 1 Accent 4" w:semiHidden="0" w:uiPriority="65" w:unhideWhenUsed="0"/>
+    <w:lsdException w:name="Medium List 2 Accent 4" w:semiHidden="0" w:uiPriority="66" w:unhideWhenUsed="0"/>
+    <w:lsdException w:name="Medium Grid 1 Accent 4" w:semiHidden="0" w:uiPriority="67" w:unhideWhenUsed="0"/>
+    <w:lsdException w:name="Medium Grid 2 Accent 4" w:semiHidden="0" w:uiPriority="68" w:unhideWhenUsed="0"/>
+    <w:lsdException w:name="Medium Grid 3 Accent 4" w:semiHidden="0" w:uiPriority="69" w:unhideWhenUsed="0"/>
+    <w:lsdException w:name="Dark List Accent 4" w:semiHidden="0" w:uiPriority="70" w:unhideWhenUsed="0"/>
+    <w:lsdException w:name="Colorful Shading Accent 4" w:semiHidden="0" w:uiPriority="71" w:unhideWhenUsed="0"/>
+    <w:lsdException w:name="Colorful List Accent 4" w:semiHidden="0" w:uiPriority="72" w:unhideWhenUsed="0"/>
+    <w:lsdException w:name="Colorful Grid Accent 4" w:semiHidden="0" w:uiPriority="73" w:unhideWhenUsed="0"/>
+    <w:lsdException w:name="Light Shading Accent 5" w:semiHidden="0" w:uiPriority="60" w:unhideWhenUsed="0"/>
+    <w:lsdException w:name="Light List Accent 5" w:semiHidden="0" w:uiPriority="61" w:unhideWhenUsed="0"/>
+    <w:lsdException w:name="Light Grid Accent 5" w:semiHidden="0" w:uiPriority="62" w:unhideWhenUsed="0"/>
+    <w:lsdException w:name="Medium Shading 1 Accent 5" w:semiHidden="0" w:uiPriority="63" w:unhideWhenUsed="0"/>
+    <w:lsdException w:name="Medium Shading 2 Accent 5" w:semiHidden="0" w:uiPriority="64" w:unhideWhenUsed="0"/>
+    <w:lsdException w:name="Medium List 1 Accent 5" w:semiHidden="0" w:uiPriority="65" w:unhideWhenUsed="0"/>
+    <w:lsdException w:name="Medium List 2 Accent 5" w:semiHidden="0" w:uiPriority="66" w:unhideWhenUsed="0"/>
+    <w:lsdException w:name="Medium Grid 1 Accent 5" w:semiHidden="0" w:uiPriority="67" w:unhideWhenUsed="0"/>
+    <w:lsdException w:name="Medium Grid 2 Accent 5" w:semiHidden="0" w:uiPriority="68" w:unhideWhenUsed="0"/>
+    <w:lsdException w:name="Medium Grid 3 Accent 5" w:semiHidden="0" w:uiPriority="69" w:unhideWhenUsed="0"/>
+    <w:lsdException w:name="Dark List Accent 5" w:semiHidden="0" w:uiPriority="70" w:unhideWhenUsed="0"/>
+    <w:lsdException w:name="Colorful Shading Accent 5" w:semiHidden="0" w:uiPriority="71" w:unhideWhenUsed="0"/>
+    <w:lsdException w:name="Colorful List Accent 5" w:semiHidden="0" w:uiPriority="72" w:unhideWhenUsed="0"/>
+    <w:lsdException w:name="Colorful Grid Accent 5" w:semiHidden="0" w:uiPriority="73" w:unhideWhenUsed="0"/>
+    <w:lsdException w:name="Light Shading Accent 6" w:semiHidden="0" w:uiPriority="60" w:unhideWhenUsed="0"/>
+    <w:lsdException w:name="Light List Accent 6" w:semiHidden="0" w:uiPriority="61" w:unhideWhenUsed="0"/>
+    <w:lsdException w:name="Light Grid Accent 6" w:semiHidden="0" w:uiPriority="62" w:unhideWhenUsed="0"/>
+    <w:lsdException w:name="Medium Shading 1 Accent 6" w:semiHidden="0" w:uiPriority="63" w:unhideWhenUsed="0"/>
+    <w:lsdException w:name="Medium Shading 2 Accent 6" w:semiHidden="0" w:uiPriority="64" w:unhideWhenUsed="0"/>
+    <w:lsdException w:name="Medium List 1 Accent 6" w:semiHidden="0" w:uiPriority="65" w:unhideWhenUsed="0"/>
+    <w:lsdException w:name="Medium List 2 Accent 6" w:semiHidden="0" w:uiPriority="66" w:unhideWhenUsed="0"/>
+    <w:lsdException w:name="Medium Grid 1 Accent 6" w:semiHidden="0" w:uiPriority="67" w:unhideWhenUsed="0"/>
+    <w:lsdException w:name="Medium Grid 2 Accent 6" w:semiHidden="0" w:uiPriority="68" w:unhideWhenUsed="0"/>
+    <w:lsdException w:name="Medium Grid 3 Accent 6" w:semiHidden="0" w:uiPriority="69" w:unhideWhenUsed="0"/>
+    <w:lsdException w:name="Dark List Accent 6" w:semiHidden="0" w:uiPriority="70" w:unhideWhenUsed="0"/>
+    <w:lsdException w:name="Colorful Shading Accent 6" w:semiHidden="0" w:uiPriority="71" w:unhideWhenUsed="0"/>
+    <w:lsdException w:name="Colorful List Accent 6" w:semiHidden="0" w:uiPriority="72" w:unhideWhenUsed="0"/>
+    <w:lsdException w:name="Colorful Grid Accent 6" w:semiHidden="0" w:uiPriority="73" w:unhideWhenUsed="0"/>
+    <w:lsdException w:name="Subtle Emphasis" w:semiHidden="0" w:uiPriority="19" w:unhideWhenUsed="0" w:qFormat="1"/>
+    <w:lsdException w:name="Intense Emphasis" w:semiHidden="0" w:uiPriority="21" w:unhideWhenUsed="0" w:qFormat="1"/>
+    <w:lsdException w:name="Subtle Reference" w:semiHidden="0" w:uiPriority="31" w:unhideWhenUsed="0" w:qFormat="1"/>
+    <w:lsdException w:name="Intense Reference" w:semiHidden="0" w:uiPriority="32" w:unhideWhenUsed="0" w:qFormat="1"/>
+    <w:lsdException w:name="Book Title" w:semiHidden="0" w:uiPriority="33" w:unhideWhenUsed="0" w:qFormat="1"/>
+    <w:lsdException w:name="Bibliography" w:uiPriority="37"/>
+    <w:lsdException w:name="TOC Heading" w:uiPriority="39" w:qFormat="1"/>
   </w:latentStyles>
   <w:style w:type="paragraph" w:default="1" w:styleId="Normal">
     <w:name w:val="Normal"/>
@@ -2522,6 +3312,810 @@
         <w:insideV w:val="single" w:sz="4" w:space="0" w:color="auto"/>
       </w:tblBorders>
     </w:tblPr>
+  </w:style>
+  <w:style w:type="paragraph" w:styleId="Textodebalo">
+    <w:name w:val="Balloon Text"/>
+    <w:basedOn w:val="Normal"/>
+    <w:link w:val="TextodebaloChar"/>
+    <w:uiPriority w:val="99"/>
+    <w:semiHidden/>
+    <w:unhideWhenUsed/>
+    <w:rsid w:val="00DA3957"/>
+    <w:pPr>
+      <w:spacing w:after="0" w:line="240" w:lineRule="auto"/>
+    </w:pPr>
+    <w:rPr>
+      <w:rFonts w:ascii="Tahoma" w:hAnsi="Tahoma" w:cs="Tahoma"/>
+      <w:sz w:val="16"/>
+      <w:szCs w:val="16"/>
+    </w:rPr>
+  </w:style>
+  <w:style w:type="character" w:customStyle="1" w:styleId="TextodebaloChar">
+    <w:name w:val="Texto de balão Char"/>
+    <w:basedOn w:val="Fontepargpadro"/>
+    <w:link w:val="Textodebalo"/>
+    <w:uiPriority w:val="99"/>
+    <w:semiHidden/>
+    <w:rsid w:val="00DA3957"/>
+    <w:rPr>
+      <w:rFonts w:ascii="Tahoma" w:hAnsi="Tahoma" w:cs="Tahoma"/>
+      <w:sz w:val="16"/>
+      <w:szCs w:val="16"/>
+    </w:rPr>
+  </w:style>
+</w:styles>
+</file>
+
+<file path=word/stylesWithEffects.xml><?xml version="1.0" encoding="utf-8"?>
+<w:styles xmlns:wpc="http://schemas.microsoft.com/office/word/2010/wordprocessingCanvas" xmlns:mc="http://schemas.openxmlformats.org/markup-compatibility/2006" xmlns:o="urn:schemas-microsoft-com:office:office" xmlns:r="http://schemas.openxmlformats.org/officeDocument/2006/relationships" xmlns:m="http://schemas.openxmlformats.org/officeDocument/2006/math" xmlns:v="urn:schemas-microsoft-com:vml" xmlns:wp14="http://schemas.microsoft.com/office/word/2010/wordprocessingDrawing" xmlns:wp="http://schemas.openxmlformats.org/drawingml/2006/wordprocessingDrawing" xmlns:w10="urn:schemas-microsoft-com:office:word" xmlns:w="http://schemas.openxmlformats.org/wordprocessingml/2006/main" xmlns:w14="http://schemas.microsoft.com/office/word/2010/wordml" xmlns:wpg="http://schemas.microsoft.com/office/word/2010/wordprocessingGroup" xmlns:wpi="http://schemas.microsoft.com/office/word/2010/wordprocessingInk" xmlns:wne="http://schemas.microsoft.com/office/word/2006/wordml" xmlns:wps="http://schemas.microsoft.com/office/word/2010/wordprocessingShape" mc:Ignorable="w14 wp14">
+  <w:docDefaults>
+    <w:rPrDefault>
+      <w:rPr>
+        <w:rFonts w:asciiTheme="minorHAnsi" w:eastAsiaTheme="minorHAnsi" w:hAnsiTheme="minorHAnsi" w:cstheme="minorBidi"/>
+        <w:kern w:val="2"/>
+        <w:sz w:val="22"/>
+        <w:szCs w:val="22"/>
+        <w:lang w:val="pt-BR" w:eastAsia="en-US" w:bidi="ar-SA"/>
+        <w14:ligatures w14:val="standardContextual"/>
+      </w:rPr>
+    </w:rPrDefault>
+    <w:pPrDefault>
+      <w:pPr>
+        <w:spacing w:after="160" w:line="259" w:lineRule="auto"/>
+      </w:pPr>
+    </w:pPrDefault>
+  </w:docDefaults>
+  <w:latentStyles w:defLockedState="0" w:defUIPriority="99" w:defSemiHidden="1" w:defUnhideWhenUsed="1" w:defQFormat="0" w:count="267">
+    <w:lsdException w:name="Normal" w:semiHidden="0" w:uiPriority="0" w:unhideWhenUsed="0" w:qFormat="1"/>
+    <w:lsdException w:name="heading 1" w:semiHidden="0" w:uiPriority="9" w:unhideWhenUsed="0" w:qFormat="1"/>
+    <w:lsdException w:name="heading 2" w:uiPriority="9" w:qFormat="1"/>
+    <w:lsdException w:name="heading 3" w:uiPriority="9" w:qFormat="1"/>
+    <w:lsdException w:name="heading 4" w:uiPriority="9" w:qFormat="1"/>
+    <w:lsdException w:name="heading 5" w:uiPriority="9" w:qFormat="1"/>
+    <w:lsdException w:name="heading 6" w:uiPriority="9" w:qFormat="1"/>
+    <w:lsdException w:name="heading 7" w:uiPriority="9" w:qFormat="1"/>
+    <w:lsdException w:name="heading 8" w:uiPriority="9" w:qFormat="1"/>
+    <w:lsdException w:name="heading 9" w:uiPriority="9" w:qFormat="1"/>
+    <w:lsdException w:name="toc 1" w:uiPriority="39"/>
+    <w:lsdException w:name="toc 2" w:uiPriority="39"/>
+    <w:lsdException w:name="toc 3" w:uiPriority="39"/>
+    <w:lsdException w:name="toc 4" w:uiPriority="39"/>
+    <w:lsdException w:name="toc 5" w:uiPriority="39"/>
+    <w:lsdException w:name="toc 6" w:uiPriority="39"/>
+    <w:lsdException w:name="toc 7" w:uiPriority="39"/>
+    <w:lsdException w:name="toc 8" w:uiPriority="39"/>
+    <w:lsdException w:name="toc 9" w:uiPriority="39"/>
+    <w:lsdException w:name="caption" w:uiPriority="35" w:qFormat="1"/>
+    <w:lsdException w:name="Title" w:semiHidden="0" w:uiPriority="10" w:unhideWhenUsed="0" w:qFormat="1"/>
+    <w:lsdException w:name="Default Paragraph Font" w:uiPriority="1"/>
+    <w:lsdException w:name="Subtitle" w:semiHidden="0" w:uiPriority="11" w:unhideWhenUsed="0" w:qFormat="1"/>
+    <w:lsdException w:name="Strong" w:semiHidden="0" w:uiPriority="22" w:unhideWhenUsed="0" w:qFormat="1"/>
+    <w:lsdException w:name="Emphasis" w:semiHidden="0" w:uiPriority="20" w:unhideWhenUsed="0" w:qFormat="1"/>
+    <w:lsdException w:name="Table Grid" w:semiHidden="0" w:uiPriority="39" w:unhideWhenUsed="0"/>
+    <w:lsdException w:name="Placeholder Text" w:unhideWhenUsed="0"/>
+    <w:lsdException w:name="No Spacing" w:semiHidden="0" w:uiPriority="1" w:unhideWhenUsed="0" w:qFormat="1"/>
+    <w:lsdException w:name="Light Shading" w:semiHidden="0" w:uiPriority="60" w:unhideWhenUsed="0"/>
+    <w:lsdException w:name="Light List" w:semiHidden="0" w:uiPriority="61" w:unhideWhenUsed="0"/>
+    <w:lsdException w:name="Light Grid" w:semiHidden="0" w:uiPriority="62" w:unhideWhenUsed="0"/>
+    <w:lsdException w:name="Medium Shading 1" w:semiHidden="0" w:uiPriority="63" w:unhideWhenUsed="0"/>
+    <w:lsdException w:name="Medium Shading 2" w:semiHidden="0" w:uiPriority="64" w:unhideWhenUsed="0"/>
+    <w:lsdException w:name="Medium List 1" w:semiHidden="0" w:uiPriority="65" w:unhideWhenUsed="0"/>
+    <w:lsdException w:name="Medium List 2" w:semiHidden="0" w:uiPriority="66" w:unhideWhenUsed="0"/>
+    <w:lsdException w:name="Medium Grid 1" w:semiHidden="0" w:uiPriority="67" w:unhideWhenUsed="0"/>
+    <w:lsdException w:name="Medium Grid 2" w:semiHidden="0" w:uiPriority="68" w:unhideWhenUsed="0"/>
+    <w:lsdException w:name="Medium Grid 3" w:semiHidden="0" w:uiPriority="69" w:unhideWhenUsed="0"/>
+    <w:lsdException w:name="Dark List" w:semiHidden="0" w:uiPriority="70" w:unhideWhenUsed="0"/>
+    <w:lsdException w:name="Colorful Shading" w:semiHidden="0" w:uiPriority="71" w:unhideWhenUsed="0"/>
+    <w:lsdException w:name="Colorful List" w:semiHidden="0" w:uiPriority="72" w:unhideWhenUsed="0"/>
+    <w:lsdException w:name="Colorful Grid" w:semiHidden="0" w:uiPriority="73" w:unhideWhenUsed="0"/>
+    <w:lsdException w:name="Light Shading Accent 1" w:semiHidden="0" w:uiPriority="60" w:unhideWhenUsed="0"/>
+    <w:lsdException w:name="Light List Accent 1" w:semiHidden="0" w:uiPriority="61" w:unhideWhenUsed="0"/>
+    <w:lsdException w:name="Light Grid Accent 1" w:semiHidden="0" w:uiPriority="62" w:unhideWhenUsed="0"/>
+    <w:lsdException w:name="Medium Shading 1 Accent 1" w:semiHidden="0" w:uiPriority="63" w:unhideWhenUsed="0"/>
+    <w:lsdException w:name="Medium Shading 2 Accent 1" w:semiHidden="0" w:uiPriority="64" w:unhideWhenUsed="0"/>
+    <w:lsdException w:name="Medium List 1 Accent 1" w:semiHidden="0" w:uiPriority="65" w:unhideWhenUsed="0"/>
+    <w:lsdException w:name="Revision" w:unhideWhenUsed="0"/>
+    <w:lsdException w:name="List Paragraph" w:semiHidden="0" w:uiPriority="34" w:unhideWhenUsed="0" w:qFormat="1"/>
+    <w:lsdException w:name="Quote" w:semiHidden="0" w:uiPriority="29" w:unhideWhenUsed="0" w:qFormat="1"/>
+    <w:lsdException w:name="Intense Quote" w:semiHidden="0" w:uiPriority="30" w:unhideWhenUsed="0" w:qFormat="1"/>
+    <w:lsdException w:name="Medium List 2 Accent 1" w:semiHidden="0" w:uiPriority="66" w:unhideWhenUsed="0"/>
+    <w:lsdException w:name="Medium Grid 1 Accent 1" w:semiHidden="0" w:uiPriority="67" w:unhideWhenUsed="0"/>
+    <w:lsdException w:name="Medium Grid 2 Accent 1" w:semiHidden="0" w:uiPriority="68" w:unhideWhenUsed="0"/>
+    <w:lsdException w:name="Medium Grid 3 Accent 1" w:semiHidden="0" w:uiPriority="69" w:unhideWhenUsed="0"/>
+    <w:lsdException w:name="Dark List Accent 1" w:semiHidden="0" w:uiPriority="70" w:unhideWhenUsed="0"/>
+    <w:lsdException w:name="Colorful Shading Accent 1" w:semiHidden="0" w:uiPriority="71" w:unhideWhenUsed="0"/>
+    <w:lsdException w:name="Colorful List Accent 1" w:semiHidden="0" w:uiPriority="72" w:unhideWhenUsed="0"/>
+    <w:lsdException w:name="Colorful Grid Accent 1" w:semiHidden="0" w:uiPriority="73" w:unhideWhenUsed="0"/>
+    <w:lsdException w:name="Light Shading Accent 2" w:semiHidden="0" w:uiPriority="60" w:unhideWhenUsed="0"/>
+    <w:lsdException w:name="Light List Accent 2" w:semiHidden="0" w:uiPriority="61" w:unhideWhenUsed="0"/>
+    <w:lsdException w:name="Light Grid Accent 2" w:semiHidden="0" w:uiPriority="62" w:unhideWhenUsed="0"/>
+    <w:lsdException w:name="Medium Shading 1 Accent 2" w:semiHidden="0" w:uiPriority="63" w:unhideWhenUsed="0"/>
+    <w:lsdException w:name="Medium Shading 2 Accent 2" w:semiHidden="0" w:uiPriority="64" w:unhideWhenUsed="0"/>
+    <w:lsdException w:name="Medium List 1 Accent 2" w:semiHidden="0" w:uiPriority="65" w:unhideWhenUsed="0"/>
+    <w:lsdException w:name="Medium List 2 Accent 2" w:semiHidden="0" w:uiPriority="66" w:unhideWhenUsed="0"/>
+    <w:lsdException w:name="Medium Grid 1 Accent 2" w:semiHidden="0" w:uiPriority="67" w:unhideWhenUsed="0"/>
+    <w:lsdException w:name="Medium Grid 2 Accent 2" w:semiHidden="0" w:uiPriority="68" w:unhideWhenUsed="0"/>
+    <w:lsdException w:name="Medium Grid 3 Accent 2" w:semiHidden="0" w:uiPriority="69" w:unhideWhenUsed="0"/>
+    <w:lsdException w:name="Dark List Accent 2" w:semiHidden="0" w:uiPriority="70" w:unhideWhenUsed="0"/>
+    <w:lsdException w:name="Colorful Shading Accent 2" w:semiHidden="0" w:uiPriority="71" w:unhideWhenUsed="0"/>
+    <w:lsdException w:name="Colorful List Accent 2" w:semiHidden="0" w:uiPriority="72" w:unhideWhenUsed="0"/>
+    <w:lsdException w:name="Colorful Grid Accent 2" w:semiHidden="0" w:uiPriority="73" w:unhideWhenUsed="0"/>
+    <w:lsdException w:name="Light Shading Accent 3" w:semiHidden="0" w:uiPriority="60" w:unhideWhenUsed="0"/>
+    <w:lsdException w:name="Light List Accent 3" w:semiHidden="0" w:uiPriority="61" w:unhideWhenUsed="0"/>
+    <w:lsdException w:name="Light Grid Accent 3" w:semiHidden="0" w:uiPriority="62" w:unhideWhenUsed="0"/>
+    <w:lsdException w:name="Medium Shading 1 Accent 3" w:semiHidden="0" w:uiPriority="63" w:unhideWhenUsed="0"/>
+    <w:lsdException w:name="Medium Shading 2 Accent 3" w:semiHidden="0" w:uiPriority="64" w:unhideWhenUsed="0"/>
+    <w:lsdException w:name="Medium List 1 Accent 3" w:semiHidden="0" w:uiPriority="65" w:unhideWhenUsed="0"/>
+    <w:lsdException w:name="Medium List 2 Accent 3" w:semiHidden="0" w:uiPriority="66" w:unhideWhenUsed="0"/>
+    <w:lsdException w:name="Medium Grid 1 Accent 3" w:semiHidden="0" w:uiPriority="67" w:unhideWhenUsed="0"/>
+    <w:lsdException w:name="Medium Grid 2 Accent 3" w:semiHidden="0" w:uiPriority="68" w:unhideWhenUsed="0"/>
+    <w:lsdException w:name="Medium Grid 3 Accent 3" w:semiHidden="0" w:uiPriority="69" w:unhideWhenUsed="0"/>
+    <w:lsdException w:name="Dark List Accent 3" w:semiHidden="0" w:uiPriority="70" w:unhideWhenUsed="0"/>
+    <w:lsdException w:name="Colorful Shading Accent 3" w:semiHidden="0" w:uiPriority="71" w:unhideWhenUsed="0"/>
+    <w:lsdException w:name="Colorful List Accent 3" w:semiHidden="0" w:uiPriority="72" w:unhideWhenUsed="0"/>
+    <w:lsdException w:name="Colorful Grid Accent 3" w:semiHidden="0" w:uiPriority="73" w:unhideWhenUsed="0"/>
+    <w:lsdException w:name="Light Shading Accent 4" w:semiHidden="0" w:uiPriority="60" w:unhideWhenUsed="0"/>
+    <w:lsdException w:name="Light List Accent 4" w:semiHidden="0" w:uiPriority="61" w:unhideWhenUsed="0"/>
+    <w:lsdException w:name="Light Grid Accent 4" w:semiHidden="0" w:uiPriority="62" w:unhideWhenUsed="0"/>
+    <w:lsdException w:name="Medium Shading 1 Accent 4" w:semiHidden="0" w:uiPriority="63" w:unhideWhenUsed="0"/>
+    <w:lsdException w:name="Medium Shading 2 Accent 4" w:semiHidden="0" w:uiPriority="64" w:unhideWhenUsed="0"/>
+    <w:lsdException w:name="Medium List 1 Accent 4" w:semiHidden="0" w:uiPriority="65" w:unhideWhenUsed="0"/>
+    <w:lsdException w:name="Medium List 2 Accent 4" w:semiHidden="0" w:uiPriority="66" w:unhideWhenUsed="0"/>
+    <w:lsdException w:name="Medium Grid 1 Accent 4" w:semiHidden="0" w:uiPriority="67" w:unhideWhenUsed="0"/>
+    <w:lsdException w:name="Medium Grid 2 Accent 4" w:semiHidden="0" w:uiPriority="68" w:unhideWhenUsed="0"/>
+    <w:lsdException w:name="Medium Grid 3 Accent 4" w:semiHidden="0" w:uiPriority="69" w:unhideWhenUsed="0"/>
+    <w:lsdException w:name="Dark List Accent 4" w:semiHidden="0" w:uiPriority="70" w:unhideWhenUsed="0"/>
+    <w:lsdException w:name="Colorful Shading Accent 4" w:semiHidden="0" w:uiPriority="71" w:unhideWhenUsed="0"/>
+    <w:lsdException w:name="Colorful List Accent 4" w:semiHidden="0" w:uiPriority="72" w:unhideWhenUsed="0"/>
+    <w:lsdException w:name="Colorful Grid Accent 4" w:semiHidden="0" w:uiPriority="73" w:unhideWhenUsed="0"/>
+    <w:lsdException w:name="Light Shading Accent 5" w:semiHidden="0" w:uiPriority="60" w:unhideWhenUsed="0"/>
+    <w:lsdException w:name="Light List Accent 5" w:semiHidden="0" w:uiPriority="61" w:unhideWhenUsed="0"/>
+    <w:lsdException w:name="Light Grid Accent 5" w:semiHidden="0" w:uiPriority="62" w:unhideWhenUsed="0"/>
+    <w:lsdException w:name="Medium Shading 1 Accent 5" w:semiHidden="0" w:uiPriority="63" w:unhideWhenUsed="0"/>
+    <w:lsdException w:name="Medium Shading 2 Accent 5" w:semiHidden="0" w:uiPriority="64" w:unhideWhenUsed="0"/>
+    <w:lsdException w:name="Medium List 1 Accent 5" w:semiHidden="0" w:uiPriority="65" w:unhideWhenUsed="0"/>
+    <w:lsdException w:name="Medium List 2 Accent 5" w:semiHidden="0" w:uiPriority="66" w:unhideWhenUsed="0"/>
+    <w:lsdException w:name="Medium Grid 1 Accent 5" w:semiHidden="0" w:uiPriority="67" w:unhideWhenUsed="0"/>
+    <w:lsdException w:name="Medium Grid 2 Accent 5" w:semiHidden="0" w:uiPriority="68" w:unhideWhenUsed="0"/>
+    <w:lsdException w:name="Medium Grid 3 Accent 5" w:semiHidden="0" w:uiPriority="69" w:unhideWhenUsed="0"/>
+    <w:lsdException w:name="Dark List Accent 5" w:semiHidden="0" w:uiPriority="70" w:unhideWhenUsed="0"/>
+    <w:lsdException w:name="Colorful Shading Accent 5" w:semiHidden="0" w:uiPriority="71" w:unhideWhenUsed="0"/>
+    <w:lsdException w:name="Colorful List Accent 5" w:semiHidden="0" w:uiPriority="72" w:unhideWhenUsed="0"/>
+    <w:lsdException w:name="Colorful Grid Accent 5" w:semiHidden="0" w:uiPriority="73" w:unhideWhenUsed="0"/>
+    <w:lsdException w:name="Light Shading Accent 6" w:semiHidden="0" w:uiPriority="60" w:unhideWhenUsed="0"/>
+    <w:lsdException w:name="Light List Accent 6" w:semiHidden="0" w:uiPriority="61" w:unhideWhenUsed="0"/>
+    <w:lsdException w:name="Light Grid Accent 6" w:semiHidden="0" w:uiPriority="62" w:unhideWhenUsed="0"/>
+    <w:lsdException w:name="Medium Shading 1 Accent 6" w:semiHidden="0" w:uiPriority="63" w:unhideWhenUsed="0"/>
+    <w:lsdException w:name="Medium Shading 2 Accent 6" w:semiHidden="0" w:uiPriority="64" w:unhideWhenUsed="0"/>
+    <w:lsdException w:name="Medium List 1 Accent 6" w:semiHidden="0" w:uiPriority="65" w:unhideWhenUsed="0"/>
+    <w:lsdException w:name="Medium List 2 Accent 6" w:semiHidden="0" w:uiPriority="66" w:unhideWhenUsed="0"/>
+    <w:lsdException w:name="Medium Grid 1 Accent 6" w:semiHidden="0" w:uiPriority="67" w:unhideWhenUsed="0"/>
+    <w:lsdException w:name="Medium Grid 2 Accent 6" w:semiHidden="0" w:uiPriority="68" w:unhideWhenUsed="0"/>
+    <w:lsdException w:name="Medium Grid 3 Accent 6" w:semiHidden="0" w:uiPriority="69" w:unhideWhenUsed="0"/>
+    <w:lsdException w:name="Dark List Accent 6" w:semiHidden="0" w:uiPriority="70" w:unhideWhenUsed="0"/>
+    <w:lsdException w:name="Colorful Shading Accent 6" w:semiHidden="0" w:uiPriority="71" w:unhideWhenUsed="0"/>
+    <w:lsdException w:name="Colorful List Accent 6" w:semiHidden="0" w:uiPriority="72" w:unhideWhenUsed="0"/>
+    <w:lsdException w:name="Colorful Grid Accent 6" w:semiHidden="0" w:uiPriority="73" w:unhideWhenUsed="0"/>
+    <w:lsdException w:name="Subtle Emphasis" w:semiHidden="0" w:uiPriority="19" w:unhideWhenUsed="0" w:qFormat="1"/>
+    <w:lsdException w:name="Intense Emphasis" w:semiHidden="0" w:uiPriority="21" w:unhideWhenUsed="0" w:qFormat="1"/>
+    <w:lsdException w:name="Subtle Reference" w:semiHidden="0" w:uiPriority="31" w:unhideWhenUsed="0" w:qFormat="1"/>
+    <w:lsdException w:name="Intense Reference" w:semiHidden="0" w:uiPriority="32" w:unhideWhenUsed="0" w:qFormat="1"/>
+    <w:lsdException w:name="Book Title" w:semiHidden="0" w:uiPriority="33" w:unhideWhenUsed="0" w:qFormat="1"/>
+    <w:lsdException w:name="Bibliography" w:uiPriority="37"/>
+    <w:lsdException w:name="TOC Heading" w:uiPriority="39" w:qFormat="1"/>
+  </w:latentStyles>
+  <w:style w:type="paragraph" w:default="1" w:styleId="Normal">
+    <w:name w:val="Normal"/>
+    <w:qFormat/>
+  </w:style>
+  <w:style w:type="paragraph" w:styleId="Ttulo1">
+    <w:name w:val="heading 1"/>
+    <w:basedOn w:val="Normal"/>
+    <w:next w:val="Normal"/>
+    <w:link w:val="Ttulo1Char"/>
+    <w:uiPriority w:val="9"/>
+    <w:qFormat/>
+    <w:rsid w:val="00140D25"/>
+    <w:pPr>
+      <w:keepNext/>
+      <w:keepLines/>
+      <w:spacing w:before="360" w:after="80"/>
+      <w:outlineLvl w:val="0"/>
+    </w:pPr>
+    <w:rPr>
+      <w:rFonts w:asciiTheme="majorHAnsi" w:eastAsiaTheme="majorEastAsia" w:hAnsiTheme="majorHAnsi" w:cstheme="majorBidi"/>
+      <w:color w:val="0F4761" w:themeColor="accent1" w:themeShade="BF"/>
+      <w:sz w:val="40"/>
+      <w:szCs w:val="40"/>
+    </w:rPr>
+  </w:style>
+  <w:style w:type="paragraph" w:styleId="Ttulo2">
+    <w:name w:val="heading 2"/>
+    <w:basedOn w:val="Normal"/>
+    <w:next w:val="Normal"/>
+    <w:link w:val="Ttulo2Char"/>
+    <w:uiPriority w:val="9"/>
+    <w:semiHidden/>
+    <w:unhideWhenUsed/>
+    <w:qFormat/>
+    <w:rsid w:val="00140D25"/>
+    <w:pPr>
+      <w:keepNext/>
+      <w:keepLines/>
+      <w:spacing w:before="160" w:after="80"/>
+      <w:outlineLvl w:val="1"/>
+    </w:pPr>
+    <w:rPr>
+      <w:rFonts w:asciiTheme="majorHAnsi" w:eastAsiaTheme="majorEastAsia" w:hAnsiTheme="majorHAnsi" w:cstheme="majorBidi"/>
+      <w:color w:val="0F4761" w:themeColor="accent1" w:themeShade="BF"/>
+      <w:sz w:val="32"/>
+      <w:szCs w:val="32"/>
+    </w:rPr>
+  </w:style>
+  <w:style w:type="paragraph" w:styleId="Ttulo3">
+    <w:name w:val="heading 3"/>
+    <w:basedOn w:val="Normal"/>
+    <w:next w:val="Normal"/>
+    <w:link w:val="Ttulo3Char"/>
+    <w:uiPriority w:val="9"/>
+    <w:semiHidden/>
+    <w:unhideWhenUsed/>
+    <w:qFormat/>
+    <w:rsid w:val="00140D25"/>
+    <w:pPr>
+      <w:keepNext/>
+      <w:keepLines/>
+      <w:spacing w:before="160" w:after="80"/>
+      <w:outlineLvl w:val="2"/>
+    </w:pPr>
+    <w:rPr>
+      <w:rFonts w:eastAsiaTheme="majorEastAsia" w:cstheme="majorBidi"/>
+      <w:color w:val="0F4761" w:themeColor="accent1" w:themeShade="BF"/>
+      <w:sz w:val="28"/>
+      <w:szCs w:val="28"/>
+    </w:rPr>
+  </w:style>
+  <w:style w:type="paragraph" w:styleId="Ttulo4">
+    <w:name w:val="heading 4"/>
+    <w:basedOn w:val="Normal"/>
+    <w:next w:val="Normal"/>
+    <w:link w:val="Ttulo4Char"/>
+    <w:uiPriority w:val="9"/>
+    <w:semiHidden/>
+    <w:unhideWhenUsed/>
+    <w:qFormat/>
+    <w:rsid w:val="00140D25"/>
+    <w:pPr>
+      <w:keepNext/>
+      <w:keepLines/>
+      <w:spacing w:before="80" w:after="40"/>
+      <w:outlineLvl w:val="3"/>
+    </w:pPr>
+    <w:rPr>
+      <w:rFonts w:eastAsiaTheme="majorEastAsia" w:cstheme="majorBidi"/>
+      <w:i/>
+      <w:iCs/>
+      <w:color w:val="0F4761" w:themeColor="accent1" w:themeShade="BF"/>
+    </w:rPr>
+  </w:style>
+  <w:style w:type="paragraph" w:styleId="Ttulo5">
+    <w:name w:val="heading 5"/>
+    <w:basedOn w:val="Normal"/>
+    <w:next w:val="Normal"/>
+    <w:link w:val="Ttulo5Char"/>
+    <w:uiPriority w:val="9"/>
+    <w:semiHidden/>
+    <w:unhideWhenUsed/>
+    <w:qFormat/>
+    <w:rsid w:val="00140D25"/>
+    <w:pPr>
+      <w:keepNext/>
+      <w:keepLines/>
+      <w:spacing w:before="80" w:after="40"/>
+      <w:outlineLvl w:val="4"/>
+    </w:pPr>
+    <w:rPr>
+      <w:rFonts w:eastAsiaTheme="majorEastAsia" w:cstheme="majorBidi"/>
+      <w:color w:val="0F4761" w:themeColor="accent1" w:themeShade="BF"/>
+    </w:rPr>
+  </w:style>
+  <w:style w:type="paragraph" w:styleId="Ttulo6">
+    <w:name w:val="heading 6"/>
+    <w:basedOn w:val="Normal"/>
+    <w:next w:val="Normal"/>
+    <w:link w:val="Ttulo6Char"/>
+    <w:uiPriority w:val="9"/>
+    <w:semiHidden/>
+    <w:unhideWhenUsed/>
+    <w:qFormat/>
+    <w:rsid w:val="00140D25"/>
+    <w:pPr>
+      <w:keepNext/>
+      <w:keepLines/>
+      <w:spacing w:before="40" w:after="0"/>
+      <w:outlineLvl w:val="5"/>
+    </w:pPr>
+    <w:rPr>
+      <w:rFonts w:eastAsiaTheme="majorEastAsia" w:cstheme="majorBidi"/>
+      <w:i/>
+      <w:iCs/>
+      <w:color w:val="595959" w:themeColor="text1" w:themeTint="A6"/>
+    </w:rPr>
+  </w:style>
+  <w:style w:type="paragraph" w:styleId="Ttulo7">
+    <w:name w:val="heading 7"/>
+    <w:basedOn w:val="Normal"/>
+    <w:next w:val="Normal"/>
+    <w:link w:val="Ttulo7Char"/>
+    <w:uiPriority w:val="9"/>
+    <w:semiHidden/>
+    <w:unhideWhenUsed/>
+    <w:qFormat/>
+    <w:rsid w:val="00140D25"/>
+    <w:pPr>
+      <w:keepNext/>
+      <w:keepLines/>
+      <w:spacing w:before="40" w:after="0"/>
+      <w:outlineLvl w:val="6"/>
+    </w:pPr>
+    <w:rPr>
+      <w:rFonts w:eastAsiaTheme="majorEastAsia" w:cstheme="majorBidi"/>
+      <w:color w:val="595959" w:themeColor="text1" w:themeTint="A6"/>
+    </w:rPr>
+  </w:style>
+  <w:style w:type="paragraph" w:styleId="Ttulo8">
+    <w:name w:val="heading 8"/>
+    <w:basedOn w:val="Normal"/>
+    <w:next w:val="Normal"/>
+    <w:link w:val="Ttulo8Char"/>
+    <w:uiPriority w:val="9"/>
+    <w:semiHidden/>
+    <w:unhideWhenUsed/>
+    <w:qFormat/>
+    <w:rsid w:val="00140D25"/>
+    <w:pPr>
+      <w:keepNext/>
+      <w:keepLines/>
+      <w:spacing w:after="0"/>
+      <w:outlineLvl w:val="7"/>
+    </w:pPr>
+    <w:rPr>
+      <w:rFonts w:eastAsiaTheme="majorEastAsia" w:cstheme="majorBidi"/>
+      <w:i/>
+      <w:iCs/>
+      <w:color w:val="272727" w:themeColor="text1" w:themeTint="D8"/>
+    </w:rPr>
+  </w:style>
+  <w:style w:type="paragraph" w:styleId="Ttulo9">
+    <w:name w:val="heading 9"/>
+    <w:basedOn w:val="Normal"/>
+    <w:next w:val="Normal"/>
+    <w:link w:val="Ttulo9Char"/>
+    <w:uiPriority w:val="9"/>
+    <w:semiHidden/>
+    <w:unhideWhenUsed/>
+    <w:qFormat/>
+    <w:rsid w:val="00140D25"/>
+    <w:pPr>
+      <w:keepNext/>
+      <w:keepLines/>
+      <w:spacing w:after="0"/>
+      <w:outlineLvl w:val="8"/>
+    </w:pPr>
+    <w:rPr>
+      <w:rFonts w:eastAsiaTheme="majorEastAsia" w:cstheme="majorBidi"/>
+      <w:color w:val="272727" w:themeColor="text1" w:themeTint="D8"/>
+    </w:rPr>
+  </w:style>
+  <w:style w:type="character" w:default="1" w:styleId="Fontepargpadro">
+    <w:name w:val="Default Paragraph Font"/>
+    <w:uiPriority w:val="1"/>
+    <w:semiHidden/>
+    <w:unhideWhenUsed/>
+  </w:style>
+  <w:style w:type="table" w:default="1" w:styleId="Tabelanormal">
+    <w:name w:val="Normal Table"/>
+    <w:uiPriority w:val="99"/>
+    <w:semiHidden/>
+    <w:unhideWhenUsed/>
+    <w:tblPr>
+      <w:tblInd w:w="0" w:type="dxa"/>
+      <w:tblCellMar>
+        <w:top w:w="0" w:type="dxa"/>
+        <w:left w:w="108" w:type="dxa"/>
+        <w:bottom w:w="0" w:type="dxa"/>
+        <w:right w:w="108" w:type="dxa"/>
+      </w:tblCellMar>
+    </w:tblPr>
+  </w:style>
+  <w:style w:type="numbering" w:default="1" w:styleId="Semlista">
+    <w:name w:val="No List"/>
+    <w:uiPriority w:val="99"/>
+    <w:semiHidden/>
+    <w:unhideWhenUsed/>
+  </w:style>
+  <w:style w:type="character" w:customStyle="1" w:styleId="Ttulo1Char">
+    <w:name w:val="Título 1 Char"/>
+    <w:basedOn w:val="Fontepargpadro"/>
+    <w:link w:val="Ttulo1"/>
+    <w:uiPriority w:val="9"/>
+    <w:rsid w:val="00140D25"/>
+    <w:rPr>
+      <w:rFonts w:asciiTheme="majorHAnsi" w:eastAsiaTheme="majorEastAsia" w:hAnsiTheme="majorHAnsi" w:cstheme="majorBidi"/>
+      <w:color w:val="0F4761" w:themeColor="accent1" w:themeShade="BF"/>
+      <w:sz w:val="40"/>
+      <w:szCs w:val="40"/>
+    </w:rPr>
+  </w:style>
+  <w:style w:type="character" w:customStyle="1" w:styleId="Ttulo2Char">
+    <w:name w:val="Título 2 Char"/>
+    <w:basedOn w:val="Fontepargpadro"/>
+    <w:link w:val="Ttulo2"/>
+    <w:uiPriority w:val="9"/>
+    <w:semiHidden/>
+    <w:rsid w:val="00140D25"/>
+    <w:rPr>
+      <w:rFonts w:asciiTheme="majorHAnsi" w:eastAsiaTheme="majorEastAsia" w:hAnsiTheme="majorHAnsi" w:cstheme="majorBidi"/>
+      <w:color w:val="0F4761" w:themeColor="accent1" w:themeShade="BF"/>
+      <w:sz w:val="32"/>
+      <w:szCs w:val="32"/>
+    </w:rPr>
+  </w:style>
+  <w:style w:type="character" w:customStyle="1" w:styleId="Ttulo3Char">
+    <w:name w:val="Título 3 Char"/>
+    <w:basedOn w:val="Fontepargpadro"/>
+    <w:link w:val="Ttulo3"/>
+    <w:uiPriority w:val="9"/>
+    <w:semiHidden/>
+    <w:rsid w:val="00140D25"/>
+    <w:rPr>
+      <w:rFonts w:eastAsiaTheme="majorEastAsia" w:cstheme="majorBidi"/>
+      <w:color w:val="0F4761" w:themeColor="accent1" w:themeShade="BF"/>
+      <w:sz w:val="28"/>
+      <w:szCs w:val="28"/>
+    </w:rPr>
+  </w:style>
+  <w:style w:type="character" w:customStyle="1" w:styleId="Ttulo4Char">
+    <w:name w:val="Título 4 Char"/>
+    <w:basedOn w:val="Fontepargpadro"/>
+    <w:link w:val="Ttulo4"/>
+    <w:uiPriority w:val="9"/>
+    <w:semiHidden/>
+    <w:rsid w:val="00140D25"/>
+    <w:rPr>
+      <w:rFonts w:eastAsiaTheme="majorEastAsia" w:cstheme="majorBidi"/>
+      <w:i/>
+      <w:iCs/>
+      <w:color w:val="0F4761" w:themeColor="accent1" w:themeShade="BF"/>
+    </w:rPr>
+  </w:style>
+  <w:style w:type="character" w:customStyle="1" w:styleId="Ttulo5Char">
+    <w:name w:val="Título 5 Char"/>
+    <w:basedOn w:val="Fontepargpadro"/>
+    <w:link w:val="Ttulo5"/>
+    <w:uiPriority w:val="9"/>
+    <w:semiHidden/>
+    <w:rsid w:val="00140D25"/>
+    <w:rPr>
+      <w:rFonts w:eastAsiaTheme="majorEastAsia" w:cstheme="majorBidi"/>
+      <w:color w:val="0F4761" w:themeColor="accent1" w:themeShade="BF"/>
+    </w:rPr>
+  </w:style>
+  <w:style w:type="character" w:customStyle="1" w:styleId="Ttulo6Char">
+    <w:name w:val="Título 6 Char"/>
+    <w:basedOn w:val="Fontepargpadro"/>
+    <w:link w:val="Ttulo6"/>
+    <w:uiPriority w:val="9"/>
+    <w:semiHidden/>
+    <w:rsid w:val="00140D25"/>
+    <w:rPr>
+      <w:rFonts w:eastAsiaTheme="majorEastAsia" w:cstheme="majorBidi"/>
+      <w:i/>
+      <w:iCs/>
+      <w:color w:val="595959" w:themeColor="text1" w:themeTint="A6"/>
+    </w:rPr>
+  </w:style>
+  <w:style w:type="character" w:customStyle="1" w:styleId="Ttulo7Char">
+    <w:name w:val="Título 7 Char"/>
+    <w:basedOn w:val="Fontepargpadro"/>
+    <w:link w:val="Ttulo7"/>
+    <w:uiPriority w:val="9"/>
+    <w:semiHidden/>
+    <w:rsid w:val="00140D25"/>
+    <w:rPr>
+      <w:rFonts w:eastAsiaTheme="majorEastAsia" w:cstheme="majorBidi"/>
+      <w:color w:val="595959" w:themeColor="text1" w:themeTint="A6"/>
+    </w:rPr>
+  </w:style>
+  <w:style w:type="character" w:customStyle="1" w:styleId="Ttulo8Char">
+    <w:name w:val="Título 8 Char"/>
+    <w:basedOn w:val="Fontepargpadro"/>
+    <w:link w:val="Ttulo8"/>
+    <w:uiPriority w:val="9"/>
+    <w:semiHidden/>
+    <w:rsid w:val="00140D25"/>
+    <w:rPr>
+      <w:rFonts w:eastAsiaTheme="majorEastAsia" w:cstheme="majorBidi"/>
+      <w:i/>
+      <w:iCs/>
+      <w:color w:val="272727" w:themeColor="text1" w:themeTint="D8"/>
+    </w:rPr>
+  </w:style>
+  <w:style w:type="character" w:customStyle="1" w:styleId="Ttulo9Char">
+    <w:name w:val="Título 9 Char"/>
+    <w:basedOn w:val="Fontepargpadro"/>
+    <w:link w:val="Ttulo9"/>
+    <w:uiPriority w:val="9"/>
+    <w:semiHidden/>
+    <w:rsid w:val="00140D25"/>
+    <w:rPr>
+      <w:rFonts w:eastAsiaTheme="majorEastAsia" w:cstheme="majorBidi"/>
+      <w:color w:val="272727" w:themeColor="text1" w:themeTint="D8"/>
+    </w:rPr>
+  </w:style>
+  <w:style w:type="paragraph" w:styleId="Ttulo">
+    <w:name w:val="Title"/>
+    <w:basedOn w:val="Normal"/>
+    <w:next w:val="Normal"/>
+    <w:link w:val="TtuloChar"/>
+    <w:uiPriority w:val="10"/>
+    <w:qFormat/>
+    <w:rsid w:val="00140D25"/>
+    <w:pPr>
+      <w:spacing w:after="80" w:line="240" w:lineRule="auto"/>
+      <w:contextualSpacing/>
+    </w:pPr>
+    <w:rPr>
+      <w:rFonts w:asciiTheme="majorHAnsi" w:eastAsiaTheme="majorEastAsia" w:hAnsiTheme="majorHAnsi" w:cstheme="majorBidi"/>
+      <w:spacing w:val="-10"/>
+      <w:kern w:val="28"/>
+      <w:sz w:val="56"/>
+      <w:szCs w:val="56"/>
+    </w:rPr>
+  </w:style>
+  <w:style w:type="character" w:customStyle="1" w:styleId="TtuloChar">
+    <w:name w:val="Título Char"/>
+    <w:basedOn w:val="Fontepargpadro"/>
+    <w:link w:val="Ttulo"/>
+    <w:uiPriority w:val="10"/>
+    <w:rsid w:val="00140D25"/>
+    <w:rPr>
+      <w:rFonts w:asciiTheme="majorHAnsi" w:eastAsiaTheme="majorEastAsia" w:hAnsiTheme="majorHAnsi" w:cstheme="majorBidi"/>
+      <w:spacing w:val="-10"/>
+      <w:kern w:val="28"/>
+      <w:sz w:val="56"/>
+      <w:szCs w:val="56"/>
+    </w:rPr>
+  </w:style>
+  <w:style w:type="paragraph" w:styleId="Subttulo">
+    <w:name w:val="Subtitle"/>
+    <w:basedOn w:val="Normal"/>
+    <w:next w:val="Normal"/>
+    <w:link w:val="SubttuloChar"/>
+    <w:uiPriority w:val="11"/>
+    <w:qFormat/>
+    <w:rsid w:val="00140D25"/>
+    <w:pPr>
+      <w:numPr>
+        <w:ilvl w:val="1"/>
+      </w:numPr>
+    </w:pPr>
+    <w:rPr>
+      <w:rFonts w:eastAsiaTheme="majorEastAsia" w:cstheme="majorBidi"/>
+      <w:color w:val="595959" w:themeColor="text1" w:themeTint="A6"/>
+      <w:spacing w:val="15"/>
+      <w:sz w:val="28"/>
+      <w:szCs w:val="28"/>
+    </w:rPr>
+  </w:style>
+  <w:style w:type="character" w:customStyle="1" w:styleId="SubttuloChar">
+    <w:name w:val="Subtítulo Char"/>
+    <w:basedOn w:val="Fontepargpadro"/>
+    <w:link w:val="Subttulo"/>
+    <w:uiPriority w:val="11"/>
+    <w:rsid w:val="00140D25"/>
+    <w:rPr>
+      <w:rFonts w:eastAsiaTheme="majorEastAsia" w:cstheme="majorBidi"/>
+      <w:color w:val="595959" w:themeColor="text1" w:themeTint="A6"/>
+      <w:spacing w:val="15"/>
+      <w:sz w:val="28"/>
+      <w:szCs w:val="28"/>
+    </w:rPr>
+  </w:style>
+  <w:style w:type="paragraph" w:styleId="Citao">
+    <w:name w:val="Quote"/>
+    <w:basedOn w:val="Normal"/>
+    <w:next w:val="Normal"/>
+    <w:link w:val="CitaoChar"/>
+    <w:uiPriority w:val="29"/>
+    <w:qFormat/>
+    <w:rsid w:val="00140D25"/>
+    <w:pPr>
+      <w:spacing w:before="160"/>
+      <w:jc w:val="center"/>
+    </w:pPr>
+    <w:rPr>
+      <w:i/>
+      <w:iCs/>
+      <w:color w:val="404040" w:themeColor="text1" w:themeTint="BF"/>
+    </w:rPr>
+  </w:style>
+  <w:style w:type="character" w:customStyle="1" w:styleId="CitaoChar">
+    <w:name w:val="Citação Char"/>
+    <w:basedOn w:val="Fontepargpadro"/>
+    <w:link w:val="Citao"/>
+    <w:uiPriority w:val="29"/>
+    <w:rsid w:val="00140D25"/>
+    <w:rPr>
+      <w:i/>
+      <w:iCs/>
+      <w:color w:val="404040" w:themeColor="text1" w:themeTint="BF"/>
+    </w:rPr>
+  </w:style>
+  <w:style w:type="paragraph" w:styleId="PargrafodaLista">
+    <w:name w:val="List Paragraph"/>
+    <w:basedOn w:val="Normal"/>
+    <w:uiPriority w:val="34"/>
+    <w:qFormat/>
+    <w:rsid w:val="00140D25"/>
+    <w:pPr>
+      <w:ind w:left="720"/>
+      <w:contextualSpacing/>
+    </w:pPr>
+  </w:style>
+  <w:style w:type="character" w:styleId="nfaseIntensa">
+    <w:name w:val="Intense Emphasis"/>
+    <w:basedOn w:val="Fontepargpadro"/>
+    <w:uiPriority w:val="21"/>
+    <w:qFormat/>
+    <w:rsid w:val="00140D25"/>
+    <w:rPr>
+      <w:i/>
+      <w:iCs/>
+      <w:color w:val="0F4761" w:themeColor="accent1" w:themeShade="BF"/>
+    </w:rPr>
+  </w:style>
+  <w:style w:type="paragraph" w:styleId="CitaoIntensa">
+    <w:name w:val="Intense Quote"/>
+    <w:basedOn w:val="Normal"/>
+    <w:next w:val="Normal"/>
+    <w:link w:val="CitaoIntensaChar"/>
+    <w:uiPriority w:val="30"/>
+    <w:qFormat/>
+    <w:rsid w:val="00140D25"/>
+    <w:pPr>
+      <w:pBdr>
+        <w:top w:val="single" w:sz="4" w:space="10" w:color="0F4761" w:themeColor="accent1" w:themeShade="BF"/>
+        <w:bottom w:val="single" w:sz="4" w:space="10" w:color="0F4761" w:themeColor="accent1" w:themeShade="BF"/>
+      </w:pBdr>
+      <w:spacing w:before="360" w:after="360"/>
+      <w:ind w:left="864" w:right="864"/>
+      <w:jc w:val="center"/>
+    </w:pPr>
+    <w:rPr>
+      <w:i/>
+      <w:iCs/>
+      <w:color w:val="0F4761" w:themeColor="accent1" w:themeShade="BF"/>
+    </w:rPr>
+  </w:style>
+  <w:style w:type="character" w:customStyle="1" w:styleId="CitaoIntensaChar">
+    <w:name w:val="Citação Intensa Char"/>
+    <w:basedOn w:val="Fontepargpadro"/>
+    <w:link w:val="CitaoIntensa"/>
+    <w:uiPriority w:val="30"/>
+    <w:rsid w:val="00140D25"/>
+    <w:rPr>
+      <w:i/>
+      <w:iCs/>
+      <w:color w:val="0F4761" w:themeColor="accent1" w:themeShade="BF"/>
+    </w:rPr>
+  </w:style>
+  <w:style w:type="character" w:styleId="RefernciaIntensa">
+    <w:name w:val="Intense Reference"/>
+    <w:basedOn w:val="Fontepargpadro"/>
+    <w:uiPriority w:val="32"/>
+    <w:qFormat/>
+    <w:rsid w:val="00140D25"/>
+    <w:rPr>
+      <w:b/>
+      <w:bCs/>
+      <w:smallCaps/>
+      <w:color w:val="0F4761" w:themeColor="accent1" w:themeShade="BF"/>
+      <w:spacing w:val="5"/>
+    </w:rPr>
+  </w:style>
+  <w:style w:type="paragraph" w:styleId="Cabealho">
+    <w:name w:val="header"/>
+    <w:basedOn w:val="Normal"/>
+    <w:link w:val="CabealhoChar"/>
+    <w:uiPriority w:val="99"/>
+    <w:unhideWhenUsed/>
+    <w:rsid w:val="00140D25"/>
+    <w:pPr>
+      <w:tabs>
+        <w:tab w:val="center" w:pos="4252"/>
+        <w:tab w:val="right" w:pos="8504"/>
+      </w:tabs>
+      <w:spacing w:after="0" w:line="240" w:lineRule="auto"/>
+    </w:pPr>
+  </w:style>
+  <w:style w:type="character" w:customStyle="1" w:styleId="CabealhoChar">
+    <w:name w:val="Cabeçalho Char"/>
+    <w:basedOn w:val="Fontepargpadro"/>
+    <w:link w:val="Cabealho"/>
+    <w:uiPriority w:val="99"/>
+    <w:rsid w:val="00140D25"/>
+  </w:style>
+  <w:style w:type="paragraph" w:styleId="Rodap">
+    <w:name w:val="footer"/>
+    <w:basedOn w:val="Normal"/>
+    <w:link w:val="RodapChar"/>
+    <w:uiPriority w:val="99"/>
+    <w:unhideWhenUsed/>
+    <w:rsid w:val="00140D25"/>
+    <w:pPr>
+      <w:tabs>
+        <w:tab w:val="center" w:pos="4252"/>
+        <w:tab w:val="right" w:pos="8504"/>
+      </w:tabs>
+      <w:spacing w:after="0" w:line="240" w:lineRule="auto"/>
+    </w:pPr>
+  </w:style>
+  <w:style w:type="character" w:customStyle="1" w:styleId="RodapChar">
+    <w:name w:val="Rodapé Char"/>
+    <w:basedOn w:val="Fontepargpadro"/>
+    <w:link w:val="Rodap"/>
+    <w:uiPriority w:val="99"/>
+    <w:rsid w:val="00140D25"/>
+  </w:style>
+  <w:style w:type="table" w:styleId="Tabelacomgrade">
+    <w:name w:val="Table Grid"/>
+    <w:basedOn w:val="Tabelanormal"/>
+    <w:uiPriority w:val="39"/>
+    <w:rsid w:val="00140D25"/>
+    <w:pPr>
+      <w:spacing w:after="0" w:line="240" w:lineRule="auto"/>
+    </w:pPr>
+    <w:tblPr>
+      <w:tblBorders>
+        <w:top w:val="single" w:sz="4" w:space="0" w:color="auto"/>
+        <w:left w:val="single" w:sz="4" w:space="0" w:color="auto"/>
+        <w:bottom w:val="single" w:sz="4" w:space="0" w:color="auto"/>
+        <w:right w:val="single" w:sz="4" w:space="0" w:color="auto"/>
+        <w:insideH w:val="single" w:sz="4" w:space="0" w:color="auto"/>
+        <w:insideV w:val="single" w:sz="4" w:space="0" w:color="auto"/>
+      </w:tblBorders>
+    </w:tblPr>
+  </w:style>
+  <w:style w:type="paragraph" w:styleId="Textodebalo">
+    <w:name w:val="Balloon Text"/>
+    <w:basedOn w:val="Normal"/>
+    <w:link w:val="TextodebaloChar"/>
+    <w:uiPriority w:val="99"/>
+    <w:semiHidden/>
+    <w:unhideWhenUsed/>
+    <w:rsid w:val="00DA3957"/>
+    <w:pPr>
+      <w:spacing w:after="0" w:line="240" w:lineRule="auto"/>
+    </w:pPr>
+    <w:rPr>
+      <w:rFonts w:ascii="Tahoma" w:hAnsi="Tahoma" w:cs="Tahoma"/>
+      <w:sz w:val="16"/>
+      <w:szCs w:val="16"/>
+    </w:rPr>
+  </w:style>
+  <w:style w:type="character" w:customStyle="1" w:styleId="TextodebaloChar">
+    <w:name w:val="Texto de balão Char"/>
+    <w:basedOn w:val="Fontepargpadro"/>
+    <w:link w:val="Textodebalo"/>
+    <w:uiPriority w:val="99"/>
+    <w:semiHidden/>
+    <w:rsid w:val="00DA3957"/>
+    <w:rPr>
+      <w:rFonts w:ascii="Tahoma" w:hAnsi="Tahoma" w:cs="Tahoma"/>
+      <w:sz w:val="16"/>
+      <w:szCs w:val="16"/>
+    </w:rPr>
   </w:style>
 </w:styles>
 </file>
@@ -2815,7 +4409,7 @@
   <a:extraClrSchemeLst/>
   <a:extLst>
     <a:ext uri="{05A4C25C-085E-4340-85A3-A5531E510DB2}">
-      <thm15:themeFamily xmlns:thm15="http://schemas.microsoft.com/office/thememl/2012/main" name="Office Theme" id="{62F939B6-93AF-4DB8-9C6B-D6C7DFDC589F}" vid="{4A3C46E8-61CC-4603-A589-7422A47A8E4A}"/>
+      <thm15:themeFamily xmlns:thm15="http://schemas.microsoft.com/office/thememl/2012/main" xmlns="" name="Office Theme" id="{62F939B6-93AF-4DB8-9C6B-D6C7DFDC589F}" vid="{4A3C46E8-61CC-4603-A589-7422A47A8E4A}"/>
     </a:ext>
   </a:extLst>
 </a:theme>
@@ -2826,7 +4420,7 @@
 </file>
 
 <file path=customXml/itemProps1.xml><?xml version="1.0" encoding="utf-8"?>
-<ds:datastoreItem xmlns:ds="http://schemas.openxmlformats.org/officeDocument/2006/customXml" ds:itemID="{BE6D90D7-6DF4-4C21-9386-9012E066CBB4}">
+<ds:datastoreItem xmlns:ds="http://schemas.openxmlformats.org/officeDocument/2006/customXml" ds:itemID="{767C9258-D391-4882-B748-938D272B0485}">
   <ds:schemaRefs>
     <ds:schemaRef ds:uri="http://schemas.openxmlformats.org/officeDocument/2006/bibliography"/>
   </ds:schemaRefs>

</xml_diff>